<commit_message>
Add Martabe WIs batch 6 (C2 carbon check, cyclone sampling, flocculant sampling, EW survey)
Co-Authored-By: Claude Sonnet 5.5 <noreply@anthropic.com>
Claude-Session: https://claude.ai/code/session_0121qocWgsZdFAsne2oz9sHT
</commit_message>
<xml_diff>
--- a/SWI/201-Plant-Sampling/MM-4034-033-OR-03-SWI-PRO-MET-201-005-Carbon-Concentration-Measurement-in-CIL-Tanks-RevA.docx
+++ b/SWI/201-Plant-Sampling/MM-4034-033-OR-03-SWI-PRO-MET-201-005-Carbon-Concentration-Measurement-in-CIL-Tanks-RevA.docx
@@ -602,6 +602,60 @@
       <w:pPr>
         <w:spacing w:after="100" w:before="0" w:line="245"/>
       </w:pPr>
+    </w:p>
+    <w:tbl>
+      <w:tblPr>
+        <w:tblW w:type="dxa" w:w="9026"/>
+        <w:tblBorders>
+          <w:left w:val="single" w:color="B7791F" w:sz="18"/>
+        </w:tblBorders>
+        <w:tblCellMar>
+          <w:top w:type="dxa" w:w="90"/>
+          <w:left w:type="dxa" w:w="150"/>
+          <w:bottom w:type="dxa" w:w="90"/>
+          <w:right w:type="dxa" w:w="120"/>
+        </w:tblCellMar>
+      </w:tblPr>
+      <w:tblGrid>
+        <w:gridCol w:w="9026"/>
+      </w:tblGrid>
+      <w:tr>
+        <w:tc>
+          <w:tcPr>
+            <w:tcW w:type="dxa" w:w="9026"/>
+            <w:shd w:val="clear" w:color="auto" w:fill="FFF4D6"/>
+          </w:tcPr>
+          <w:p>
+            <w:pPr>
+              <w:spacing w:after="0" w:before="0" w:line="245"/>
+            </w:pPr>
+            <w:r>
+              <w:rPr>
+                <w:rFonts w:ascii="Calibri" w:cs="Calibri" w:eastAsia="Calibri" w:hAnsi="Calibri"/>
+                <w:b/>
+                <w:bCs/>
+                <w:color w:val="7A4B00"/>
+                <w:sz w:val="17"/>
+                <w:szCs w:val="17"/>
+              </w:rPr>
+              <w:t xml:space="preserve">DRAFT FOR REVIEW. Martabe work instruction 'Carbon Analyser C2 Check' (DOC-3-MET-PRS-WIN-00048-IE, v1.0, issued 25/12/2024) added as Section 6 Part B. Not approved until reviewed. JSEA JSEA-PRO-MET-201-005 must be updated for the added hazard row.</w:t>
+            </w:r>
+          </w:p>
+        </w:tc>
+      </w:tr>
+    </w:tbl>
+    <w:p>
+      <w:pPr>
+        <w:spacing w:after="60" w:before="0" w:line="245"/>
+      </w:pPr>
+      <w:r>
+        <w:rPr>
+          <w:rFonts w:ascii="Calibri" w:cs="Calibri" w:eastAsia="Calibri" w:hAnsi="Calibri"/>
+          <w:sz w:val="17"/>
+          <w:szCs w:val="17"/>
+        </w:rPr>
+        <w:t xml:space="preserve"/>
+      </w:r>
     </w:p>
     <w:p>
       <w:pPr>
@@ -1589,6 +1643,56 @@
           </w:p>
         </w:tc>
       </w:tr>
+      <w:tr>
+        <w:tc>
+          <w:tcPr>
+            <w:tcW w:type="dxa" w:w="2900"/>
+            <w:tcMar>
+              <w:top w:type="dxa" w:w="55"/>
+              <w:left w:type="dxa" w:w="85"/>
+              <w:bottom w:type="dxa" w:w="55"/>
+              <w:right w:type="dxa" w:w="85"/>
+            </w:tcMar>
+          </w:tcPr>
+          <w:p>
+            <w:pPr>
+              <w:spacing w:after="0" w:line="235"/>
+            </w:pPr>
+            <w:r>
+              <w:rPr>
+                <w:rFonts w:ascii="Calibri" w:cs="Calibri" w:eastAsia="Calibri" w:hAnsi="Calibri"/>
+                <w:sz w:val="16"/>
+                <w:szCs w:val="16"/>
+              </w:rPr>
+              <w:t xml:space="preserve">[JSEA to confirm] Pinch point at the sampling point cover and the bucket sampler</w:t>
+            </w:r>
+          </w:p>
+        </w:tc>
+        <w:tc>
+          <w:tcPr>
+            <w:tcW w:type="dxa" w:w="6126"/>
+            <w:tcMar>
+              <w:top w:type="dxa" w:w="55"/>
+              <w:left w:type="dxa" w:w="85"/>
+              <w:bottom w:type="dxa" w:w="55"/>
+              <w:right w:type="dxa" w:w="85"/>
+            </w:tcMar>
+          </w:tcPr>
+          <w:p>
+            <w:pPr>
+              <w:spacing w:after="0" w:line="235"/>
+            </w:pPr>
+            <w:r>
+              <w:rPr>
+                <w:rFonts w:ascii="Calibri" w:cs="Calibri" w:eastAsia="Calibri" w:hAnsi="Calibri"/>
+                <w:sz w:val="16"/>
+                <w:szCs w:val="16"/>
+              </w:rPr>
+              <w:t xml:space="preserve">Close the sampling point cover slowly and keep hands clear of the pinch point. Watch the position of the bucket sampler. Pour slurry slowly. Eyewash proven flowing. HCN controls as above: fixed monitor working, pH probe correctly placed, solution kept above pH 10.5.</w:t>
+            </w:r>
+          </w:p>
+        </w:tc>
+      </w:tr>
     </w:tbl>
     <w:p>
       <w:pPr>
@@ -2104,6 +2208,42 @@
     </w:p>
     <w:p>
       <w:pPr>
+        <w:pStyle w:val="ListParagraph"/>
+        <w:numPr>
+          <w:ilvl w:val="0"/>
+          <w:numId w:val="1"/>
+        </w:numPr>
+        <w:spacing w:after="60" w:line="245"/>
+      </w:pPr>
+      <w:r>
+        <w:rPr>
+          <w:rFonts w:ascii="Calibri" w:cs="Calibri" w:eastAsia="Calibri" w:hAnsi="Calibri"/>
+          <w:sz w:val="17"/>
+          <w:szCs w:val="17"/>
+        </w:rPr>
+        <w:t xml:space="preserve">[M] Bucket sampler for the CIL tank sampling point, sieve, funnel, 100 mL measuring cylinder, plastic bags</w:t>
+      </w:r>
+    </w:p>
+    <w:p>
+      <w:pPr>
+        <w:pStyle w:val="ListParagraph"/>
+        <w:numPr>
+          <w:ilvl w:val="0"/>
+          <w:numId w:val="1"/>
+        </w:numPr>
+        <w:spacing w:after="60" w:line="245"/>
+      </w:pPr>
+      <w:r>
+        <w:rPr>
+          <w:rFonts w:ascii="Calibri" w:cs="Calibri" w:eastAsia="Calibri" w:hAnsi="Calibri"/>
+          <w:sz w:val="17"/>
+          <w:szCs w:val="17"/>
+        </w:rPr>
+        <w:t xml:space="preserve">[M] Carbon analyser (C2) control panel and the C2 calibration instruction</w:t>
+      </w:r>
+    </w:p>
+    <w:p>
+      <w:pPr>
         <w:pStyle w:val="Heading1"/>
         <w:spacing w:after="120" w:before="260"/>
       </w:pPr>
@@ -2121,198 +2261,6 @@
     </w:p>
     <w:p>
       <w:pPr>
-        <w:ind w:left="280"/>
-        <w:spacing w:after="50" w:before="0" w:line="245"/>
-      </w:pPr>
-      <w:r>
-        <w:rPr>
-          <w:rFonts w:ascii="Calibri" w:cs="Calibri" w:eastAsia="Calibri" w:hAnsi="Calibri"/>
-          <w:b/>
-          <w:bCs/>
-          <w:sz w:val="17"/>
-          <w:szCs w:val="17"/>
-        </w:rPr>
-        <w:t xml:space="preserve">1.</w:t>
-      </w:r>
-      <w:r>
-        <w:rPr>
-          <w:rFonts w:ascii="Calibri" w:cs="Calibri" w:eastAsia="Calibri" w:hAnsi="Calibri"/>
-          <w:sz w:val="17"/>
-          <w:szCs w:val="17"/>
-        </w:rPr>
-        <w:t xml:space="preserve">  Confirm steady-state operation and notify the control room.</w:t>
-      </w:r>
-    </w:p>
-    <w:p>
-      <w:pPr>
-        <w:ind w:left="280"/>
-        <w:spacing w:after="50" w:before="0" w:line="245"/>
-      </w:pPr>
-      <w:r>
-        <w:rPr>
-          <w:rFonts w:ascii="Calibri" w:cs="Calibri" w:eastAsia="Calibri" w:hAnsi="Calibri"/>
-          <w:b/>
-          <w:bCs/>
-          <w:sz w:val="17"/>
-          <w:szCs w:val="17"/>
-        </w:rPr>
-        <w:t xml:space="preserve">2.</w:t>
-      </w:r>
-      <w:r>
-        <w:rPr>
-          <w:rFonts w:ascii="Calibri" w:cs="Calibri" w:eastAsia="Calibri" w:hAnsi="Calibri"/>
-          <w:sz w:val="17"/>
-          <w:szCs w:val="17"/>
-        </w:rPr>
-        <w:t xml:space="preserve">  Confirm the sample cutter and container are clean and free of carbon from the previous point - flush with process water.</w:t>
-      </w:r>
-    </w:p>
-    <w:p>
-      <w:pPr>
-        <w:ind w:left="280"/>
-        <w:spacing w:after="50" w:before="0" w:line="245"/>
-      </w:pPr>
-      <w:r>
-        <w:rPr>
-          <w:rFonts w:ascii="Calibri" w:cs="Calibri" w:eastAsia="Calibri" w:hAnsi="Calibri"/>
-          <w:b/>
-          <w:bCs/>
-          <w:sz w:val="17"/>
-          <w:szCs w:val="17"/>
-        </w:rPr>
-        <w:t xml:space="preserve">3.</w:t>
-      </w:r>
-      <w:r>
-        <w:rPr>
-          <w:rFonts w:ascii="Calibri" w:cs="Calibri" w:eastAsia="Calibri" w:hAnsi="Calibri"/>
-          <w:sz w:val="17"/>
-          <w:szCs w:val="17"/>
-        </w:rPr>
-        <w:t xml:space="preserve">  Take the sample with the sample cutter at CIL tank 1.</w:t>
-      </w:r>
-    </w:p>
-    <w:p>
-      <w:pPr>
-        <w:ind w:left="280"/>
-        <w:spacing w:after="50" w:before="0" w:line="245"/>
-      </w:pPr>
-      <w:r>
-        <w:rPr>
-          <w:rFonts w:ascii="Calibri" w:cs="Calibri" w:eastAsia="Calibri" w:hAnsi="Calibri"/>
-          <w:b/>
-          <w:bCs/>
-          <w:sz w:val="17"/>
-          <w:szCs w:val="17"/>
-        </w:rPr>
-        <w:t xml:space="preserve">4.</w:t>
-      </w:r>
-      <w:r>
-        <w:rPr>
-          <w:rFonts w:ascii="Calibri" w:cs="Calibri" w:eastAsia="Calibri" w:hAnsi="Calibri"/>
-          <w:sz w:val="17"/>
-          <w:szCs w:val="17"/>
-        </w:rPr>
-        <w:t xml:space="preserve">  Strain the carbon from the slurry through the 1 mm sieve.</w:t>
-      </w:r>
-    </w:p>
-    <w:p>
-      <w:pPr>
-        <w:ind w:left="280"/>
-        <w:spacing w:after="50" w:before="0" w:line="245"/>
-      </w:pPr>
-      <w:r>
-        <w:rPr>
-          <w:rFonts w:ascii="Calibri" w:cs="Calibri" w:eastAsia="Calibri" w:hAnsi="Calibri"/>
-          <w:b/>
-          <w:bCs/>
-          <w:sz w:val="17"/>
-          <w:szCs w:val="17"/>
-        </w:rPr>
-        <w:t xml:space="preserve">5.</w:t>
-      </w:r>
-      <w:r>
-        <w:rPr>
-          <w:rFonts w:ascii="Calibri" w:cs="Calibri" w:eastAsia="Calibri" w:hAnsi="Calibri"/>
-          <w:sz w:val="17"/>
-          <w:szCs w:val="17"/>
-        </w:rPr>
-        <w:t xml:space="preserve">  Wash the retained carbon free of slurry with process water.</w:t>
-      </w:r>
-    </w:p>
-    <w:p>
-      <w:pPr>
-        <w:ind w:left="280"/>
-        <w:spacing w:after="50" w:before="0" w:line="245"/>
-      </w:pPr>
-      <w:r>
-        <w:rPr>
-          <w:rFonts w:ascii="Calibri" w:cs="Calibri" w:eastAsia="Calibri" w:hAnsi="Calibri"/>
-          <w:b/>
-          <w:bCs/>
-          <w:sz w:val="17"/>
-          <w:szCs w:val="17"/>
-        </w:rPr>
-        <w:t xml:space="preserve">6.</w:t>
-      </w:r>
-      <w:r>
-        <w:rPr>
-          <w:rFonts w:ascii="Calibri" w:cs="Calibri" w:eastAsia="Calibri" w:hAnsi="Calibri"/>
-          <w:sz w:val="17"/>
-          <w:szCs w:val="17"/>
-        </w:rPr>
-        <w:t xml:space="preserve">  Measure the drained carbon volume in the measuring glass.</w:t>
-      </w:r>
-    </w:p>
-    <w:p>
-      <w:pPr>
-        <w:ind w:left="280"/>
-        <w:spacing w:after="50" w:before="0" w:line="245"/>
-      </w:pPr>
-      <w:r>
-        <w:rPr>
-          <w:rFonts w:ascii="Calibri" w:cs="Calibri" w:eastAsia="Calibri" w:hAnsi="Calibri"/>
-          <w:b/>
-          <w:bCs/>
-          <w:sz w:val="17"/>
-          <w:szCs w:val="17"/>
-        </w:rPr>
-        <w:t xml:space="preserve">7.</w:t>
-      </w:r>
-      <w:r>
-        <w:rPr>
-          <w:rFonts w:ascii="Calibri" w:cs="Calibri" w:eastAsia="Calibri" w:hAnsi="Calibri"/>
-          <w:sz w:val="17"/>
-          <w:szCs w:val="17"/>
-        </w:rPr>
-        <w:t xml:space="preserve">  Repeat for CIL tanks 2, 3, 4 and 5, cleaning the cutter and sieve between each tank.</w:t>
-      </w:r>
-    </w:p>
-    <w:p>
-      <w:pPr>
-        <w:ind w:left="280"/>
-        <w:spacing w:after="50" w:before="0" w:line="245"/>
-      </w:pPr>
-      <w:r>
-        <w:rPr>
-          <w:rFonts w:ascii="Calibri" w:cs="Calibri" w:eastAsia="Calibri" w:hAnsi="Calibri"/>
-          <w:b/>
-          <w:bCs/>
-          <w:sz w:val="17"/>
-          <w:szCs w:val="17"/>
-        </w:rPr>
-        <w:t xml:space="preserve">8.</w:t>
-      </w:r>
-      <w:r>
-        <w:rPr>
-          <w:rFonts w:ascii="Calibri" w:cs="Calibri" w:eastAsia="Calibri" w:hAnsi="Calibri"/>
-          <w:sz w:val="17"/>
-          <w:szCs w:val="17"/>
-        </w:rPr>
-        <w:t xml:space="preserve">  Calculate carbon concentration for each tank and record the profile.</w:t>
-      </w:r>
-    </w:p>
-    <w:p>
-      <w:pPr>
         <w:spacing w:after="90" w:before="180" w:line="245"/>
         <w:keepNext/>
       </w:pPr>
@@ -2325,7 +2273,7 @@
           <w:sz w:val="19"/>
           <w:szCs w:val="19"/>
         </w:rPr>
-        <w:t xml:space="preserve">Carbon concentration calculation</w:t>
+        <w:t xml:space="preserve">Part A - Carbon concentration in the CIL tanks</w:t>
       </w:r>
     </w:p>
     <w:p>
@@ -2349,7 +2297,7 @@
           <w:sz w:val="17"/>
           <w:szCs w:val="17"/>
         </w:rPr>
-        <w:t xml:space="preserve">  Carbon mass = specific gravity of carbon x carbon volume. Take SG carbon as 0.47 g/mL (0.47 t/m3) unless the laboratory has measured it on the carbon in use.</w:t>
+        <w:t xml:space="preserve">  Confirm steady-state operation and notify the control room.</w:t>
       </w:r>
     </w:p>
     <w:p>
@@ -2373,7 +2321,7 @@
           <w:sz w:val="17"/>
           <w:szCs w:val="17"/>
         </w:rPr>
-        <w:t xml:space="preserve">  Worked example - sample volume 1 L, carbon volume 20 mL: carbon mass = 0.47 g/mL x 20 mL = 9.4 g.</w:t>
+        <w:t xml:space="preserve">  Confirm the sample cutter and container are clean and free of carbon from the previous point - flush with process water.</w:t>
       </w:r>
     </w:p>
     <w:p>
@@ -2397,7 +2345,7 @@
           <w:sz w:val="17"/>
           <w:szCs w:val="17"/>
         </w:rPr>
-        <w:t xml:space="preserve">  Carbon concentration = carbon mass divided by sample volume = 9.4 g / 1 L = 9.4 g/L.</w:t>
+        <w:t xml:space="preserve">  Take the sample with the sample cutter at CIL tank 1.</w:t>
       </w:r>
     </w:p>
     <w:p>
@@ -2421,7 +2369,547 @@
           <w:sz w:val="17"/>
           <w:szCs w:val="17"/>
         </w:rPr>
+        <w:t xml:space="preserve">  Strain the carbon from the slurry through the 1 mm sieve.</w:t>
+      </w:r>
+    </w:p>
+    <w:p>
+      <w:pPr>
+        <w:ind w:left="280"/>
+        <w:spacing w:after="50" w:before="0" w:line="245"/>
+      </w:pPr>
+      <w:r>
+        <w:rPr>
+          <w:rFonts w:ascii="Calibri" w:cs="Calibri" w:eastAsia="Calibri" w:hAnsi="Calibri"/>
+          <w:b/>
+          <w:bCs/>
+          <w:sz w:val="17"/>
+          <w:szCs w:val="17"/>
+        </w:rPr>
+        <w:t xml:space="preserve">5.</w:t>
+      </w:r>
+      <w:r>
+        <w:rPr>
+          <w:rFonts w:ascii="Calibri" w:cs="Calibri" w:eastAsia="Calibri" w:hAnsi="Calibri"/>
+          <w:sz w:val="17"/>
+          <w:szCs w:val="17"/>
+        </w:rPr>
+        <w:t xml:space="preserve">  Wash the retained carbon free of slurry with process water.</w:t>
+      </w:r>
+    </w:p>
+    <w:p>
+      <w:pPr>
+        <w:ind w:left="280"/>
+        <w:spacing w:after="50" w:before="0" w:line="245"/>
+      </w:pPr>
+      <w:r>
+        <w:rPr>
+          <w:rFonts w:ascii="Calibri" w:cs="Calibri" w:eastAsia="Calibri" w:hAnsi="Calibri"/>
+          <w:b/>
+          <w:bCs/>
+          <w:sz w:val="17"/>
+          <w:szCs w:val="17"/>
+        </w:rPr>
+        <w:t xml:space="preserve">6.</w:t>
+      </w:r>
+      <w:r>
+        <w:rPr>
+          <w:rFonts w:ascii="Calibri" w:cs="Calibri" w:eastAsia="Calibri" w:hAnsi="Calibri"/>
+          <w:sz w:val="17"/>
+          <w:szCs w:val="17"/>
+        </w:rPr>
+        <w:t xml:space="preserve">  Measure the drained carbon volume in the measuring glass.</w:t>
+      </w:r>
+    </w:p>
+    <w:p>
+      <w:pPr>
+        <w:ind w:left="280"/>
+        <w:spacing w:after="50" w:before="0" w:line="245"/>
+      </w:pPr>
+      <w:r>
+        <w:rPr>
+          <w:rFonts w:ascii="Calibri" w:cs="Calibri" w:eastAsia="Calibri" w:hAnsi="Calibri"/>
+          <w:b/>
+          <w:bCs/>
+          <w:sz w:val="17"/>
+          <w:szCs w:val="17"/>
+        </w:rPr>
+        <w:t xml:space="preserve">7.</w:t>
+      </w:r>
+      <w:r>
+        <w:rPr>
+          <w:rFonts w:ascii="Calibri" w:cs="Calibri" w:eastAsia="Calibri" w:hAnsi="Calibri"/>
+          <w:sz w:val="17"/>
+          <w:szCs w:val="17"/>
+        </w:rPr>
+        <w:t xml:space="preserve">  Repeat for CIL tanks 2, 3, 4 and 5, cleaning the cutter and sieve between each tank.</w:t>
+      </w:r>
+    </w:p>
+    <w:p>
+      <w:pPr>
+        <w:ind w:left="280"/>
+        <w:spacing w:after="50" w:before="0" w:line="245"/>
+      </w:pPr>
+      <w:r>
+        <w:rPr>
+          <w:rFonts w:ascii="Calibri" w:cs="Calibri" w:eastAsia="Calibri" w:hAnsi="Calibri"/>
+          <w:b/>
+          <w:bCs/>
+          <w:sz w:val="17"/>
+          <w:szCs w:val="17"/>
+        </w:rPr>
+        <w:t xml:space="preserve">8.</w:t>
+      </w:r>
+      <w:r>
+        <w:rPr>
+          <w:rFonts w:ascii="Calibri" w:cs="Calibri" w:eastAsia="Calibri" w:hAnsi="Calibri"/>
+          <w:sz w:val="17"/>
+          <w:szCs w:val="17"/>
+        </w:rPr>
+        <w:t xml:space="preserve">  Calculate carbon concentration for each tank and record the profile.</w:t>
+      </w:r>
+    </w:p>
+    <w:p>
+      <w:pPr>
+        <w:spacing w:after="90" w:before="180" w:line="245"/>
+        <w:keepNext/>
+      </w:pPr>
+      <w:r>
+        <w:rPr>
+          <w:rFonts w:ascii="Calibri" w:cs="Calibri" w:eastAsia="Calibri" w:hAnsi="Calibri"/>
+          <w:b/>
+          <w:bCs/>
+          <w:color w:val="1F3864"/>
+          <w:sz w:val="19"/>
+          <w:szCs w:val="19"/>
+        </w:rPr>
+        <w:t xml:space="preserve">Carbon concentration calculation</w:t>
+      </w:r>
+    </w:p>
+    <w:p>
+      <w:pPr>
+        <w:ind w:left="280"/>
+        <w:spacing w:after="50" w:before="0" w:line="245"/>
+      </w:pPr>
+      <w:r>
+        <w:rPr>
+          <w:rFonts w:ascii="Calibri" w:cs="Calibri" w:eastAsia="Calibri" w:hAnsi="Calibri"/>
+          <w:b/>
+          <w:bCs/>
+          <w:sz w:val="17"/>
+          <w:szCs w:val="17"/>
+        </w:rPr>
+        <w:t xml:space="preserve">1.</w:t>
+      </w:r>
+      <w:r>
+        <w:rPr>
+          <w:rFonts w:ascii="Calibri" w:cs="Calibri" w:eastAsia="Calibri" w:hAnsi="Calibri"/>
+          <w:sz w:val="17"/>
+          <w:szCs w:val="17"/>
+        </w:rPr>
+        <w:t xml:space="preserve">  Carbon mass = specific gravity of carbon x carbon volume. Take SG carbon as 0.47 g/mL (0.47 t/m3) unless the laboratory has measured it on the carbon in use.</w:t>
+      </w:r>
+    </w:p>
+    <w:p>
+      <w:pPr>
+        <w:ind w:left="280"/>
+        <w:spacing w:after="50" w:before="0" w:line="245"/>
+      </w:pPr>
+      <w:r>
+        <w:rPr>
+          <w:rFonts w:ascii="Calibri" w:cs="Calibri" w:eastAsia="Calibri" w:hAnsi="Calibri"/>
+          <w:b/>
+          <w:bCs/>
+          <w:sz w:val="17"/>
+          <w:szCs w:val="17"/>
+        </w:rPr>
+        <w:t xml:space="preserve">2.</w:t>
+      </w:r>
+      <w:r>
+        <w:rPr>
+          <w:rFonts w:ascii="Calibri" w:cs="Calibri" w:eastAsia="Calibri" w:hAnsi="Calibri"/>
+          <w:sz w:val="17"/>
+          <w:szCs w:val="17"/>
+        </w:rPr>
+        <w:t xml:space="preserve">  Worked example - sample volume 1 L, carbon volume 20 mL: carbon mass = 0.47 g/mL x 20 mL = 9.4 g.</w:t>
+      </w:r>
+    </w:p>
+    <w:p>
+      <w:pPr>
+        <w:ind w:left="280"/>
+        <w:spacing w:after="50" w:before="0" w:line="245"/>
+      </w:pPr>
+      <w:r>
+        <w:rPr>
+          <w:rFonts w:ascii="Calibri" w:cs="Calibri" w:eastAsia="Calibri" w:hAnsi="Calibri"/>
+          <w:b/>
+          <w:bCs/>
+          <w:sz w:val="17"/>
+          <w:szCs w:val="17"/>
+        </w:rPr>
+        <w:t xml:space="preserve">3.</w:t>
+      </w:r>
+      <w:r>
+        <w:rPr>
+          <w:rFonts w:ascii="Calibri" w:cs="Calibri" w:eastAsia="Calibri" w:hAnsi="Calibri"/>
+          <w:sz w:val="17"/>
+          <w:szCs w:val="17"/>
+        </w:rPr>
+        <w:t xml:space="preserve">  Carbon concentration = carbon mass divided by sample volume = 9.4 g / 1 L = 9.4 g/L.</w:t>
+      </w:r>
+    </w:p>
+    <w:p>
+      <w:pPr>
+        <w:ind w:left="280"/>
+        <w:spacing w:after="50" w:before="0" w:line="245"/>
+      </w:pPr>
+      <w:r>
+        <w:rPr>
+          <w:rFonts w:ascii="Calibri" w:cs="Calibri" w:eastAsia="Calibri" w:hAnsi="Calibri"/>
+          <w:b/>
+          <w:bCs/>
+          <w:sz w:val="17"/>
+          <w:szCs w:val="17"/>
+        </w:rPr>
+        <w:t xml:space="preserve">4.</w:t>
+      </w:r>
+      <w:r>
+        <w:rPr>
+          <w:rFonts w:ascii="Calibri" w:cs="Calibri" w:eastAsia="Calibri" w:hAnsi="Calibri"/>
+          <w:sz w:val="17"/>
+          <w:szCs w:val="17"/>
+        </w:rPr>
         <w:t xml:space="preserve">  Record the concentration for every tank on the one sheet so the profile down the train is visible.</w:t>
+      </w:r>
+    </w:p>
+    <w:p>
+      <w:pPr>
+        <w:spacing w:after="90" w:before="180" w:line="245"/>
+        <w:keepNext/>
+      </w:pPr>
+      <w:r>
+        <w:rPr>
+          <w:rFonts w:ascii="Calibri" w:cs="Calibri" w:eastAsia="Calibri" w:hAnsi="Calibri"/>
+          <w:b/>
+          <w:bCs/>
+          <w:color w:val="1F3864"/>
+          <w:sz w:val="19"/>
+          <w:szCs w:val="19"/>
+        </w:rPr>
+        <w:t xml:space="preserve">Part B - Carbon analyser (C2) check against the manual carbon concentration [M]</w:t>
+      </w:r>
+    </w:p>
+    <w:p>
+      <w:pPr>
+        <w:spacing w:after="60" w:before="0" w:line="245"/>
+      </w:pPr>
+      <w:r>
+        <w:rPr>
+          <w:rFonts w:ascii="Calibri" w:cs="Calibri" w:eastAsia="Calibri" w:hAnsi="Calibri"/>
+          <w:sz w:val="17"/>
+          <w:szCs w:val="17"/>
+        </w:rPr>
+        <w:t xml:space="preserve">[M] = taken from the Martabe team work instruction "Carbon Analyser C2 Check (DOC-3-MET-PRS-WIN-00048-IE)" (25/12/2024). [CONFIRM] = unspecified or inconsistent in the source; resolve before this instruction is approved for use. Part A (original steps and calculation) is unchanged.</w:t>
+      </w:r>
+    </w:p>
+    <w:p>
+      <w:pPr>
+        <w:spacing w:after="60" w:before="0" w:line="245"/>
+      </w:pPr>
+      <w:r>
+        <w:rPr>
+          <w:rFonts w:ascii="Calibri" w:cs="Calibri" w:eastAsia="Calibri" w:hAnsi="Calibri"/>
+          <w:sz w:val="17"/>
+          <w:szCs w:val="17"/>
+        </w:rPr>
+        <w:t xml:space="preserve">Purpose [M]: check the carbon concentration the C2 analyser reads against a manual measurement on the same tank. [CONFIRM] no C2 analyser is named in this SWI; confirm one is fitted at this plant, and which tanks it covers.</w:t>
+      </w:r>
+    </w:p>
+    <w:p>
+      <w:pPr>
+        <w:ind w:left="280"/>
+        <w:spacing w:after="50" w:before="0" w:line="245"/>
+      </w:pPr>
+      <w:r>
+        <w:rPr>
+          <w:rFonts w:ascii="Calibri" w:cs="Calibri" w:eastAsia="Calibri" w:hAnsi="Calibri"/>
+          <w:b/>
+          <w:bCs/>
+          <w:sz w:val="17"/>
+          <w:szCs w:val="17"/>
+        </w:rPr>
+        <w:t xml:space="preserve">1.</w:t>
+      </w:r>
+      <w:r>
+        <w:rPr>
+          <w:rFonts w:ascii="Calibri" w:cs="Calibri" w:eastAsia="Calibri" w:hAnsi="Calibri"/>
+          <w:sz w:val="17"/>
+          <w:szCs w:val="17"/>
+        </w:rPr>
+        <w:t xml:space="preserve">  Take 5 minutes before starting to think through the task, each risk and the controls needed ('Take 5'). Confirm all Section 3 controls are in place and the equipment is in good condition. If not, stop and report to the Met Lab supervisor, leading hand or metallurgist [M].</w:t>
+      </w:r>
+    </w:p>
+    <w:p>
+      <w:pPr>
+        <w:ind w:left="280"/>
+        <w:spacing w:after="50" w:before="0" w:line="245"/>
+      </w:pPr>
+      <w:r>
+        <w:rPr>
+          <w:rFonts w:ascii="Calibri" w:cs="Calibri" w:eastAsia="Calibri" w:hAnsi="Calibri"/>
+          <w:b/>
+          <w:bCs/>
+          <w:sz w:val="17"/>
+          <w:szCs w:val="17"/>
+        </w:rPr>
+        <w:t xml:space="preserve">2.</w:t>
+      </w:r>
+      <w:r>
+        <w:rPr>
+          <w:rFonts w:ascii="Calibri" w:cs="Calibri" w:eastAsia="Calibri" w:hAnsi="Calibri"/>
+          <w:sz w:val="17"/>
+          <w:szCs w:val="17"/>
+        </w:rPr>
+        <w:t xml:space="preserve">  Put the bucket sampler through the sampling point into the tank and take a sample from each CIL tank. Fill the bucket, then lift it slowly. Take 2 samples (scoops) per tank.</w:t>
+      </w:r>
+    </w:p>
+    <w:p>
+      <w:pPr>
+        <w:ind w:left="280"/>
+        <w:spacing w:after="50" w:before="0" w:line="245"/>
+      </w:pPr>
+      <w:r>
+        <w:rPr>
+          <w:rFonts w:ascii="Calibri" w:cs="Calibri" w:eastAsia="Calibri" w:hAnsi="Calibri"/>
+          <w:b/>
+          <w:bCs/>
+          <w:sz w:val="17"/>
+          <w:szCs w:val="17"/>
+        </w:rPr>
+        <w:t xml:space="preserve">3.</w:t>
+      </w:r>
+      <w:r>
+        <w:rPr>
+          <w:rFonts w:ascii="Calibri" w:cs="Calibri" w:eastAsia="Calibri" w:hAnsi="Calibri"/>
+          <w:sz w:val="17"/>
+          <w:szCs w:val="17"/>
+        </w:rPr>
+        <w:t xml:space="preserve">  Pour the slurry in the bucket slowly onto the sieve to screen out the carbon.</w:t>
+      </w:r>
+    </w:p>
+    <w:p>
+      <w:pPr>
+        <w:ind w:left="280"/>
+        <w:spacing w:after="50" w:before="0" w:line="245"/>
+      </w:pPr>
+      <w:r>
+        <w:rPr>
+          <w:rFonts w:ascii="Calibri" w:cs="Calibri" w:eastAsia="Calibri" w:hAnsi="Calibri"/>
+          <w:b/>
+          <w:bCs/>
+          <w:sz w:val="17"/>
+          <w:szCs w:val="17"/>
+        </w:rPr>
+        <w:t xml:space="preserve">4.</w:t>
+      </w:r>
+      <w:r>
+        <w:rPr>
+          <w:rFonts w:ascii="Calibri" w:cs="Calibri" w:eastAsia="Calibri" w:hAnsi="Calibri"/>
+          <w:sz w:val="17"/>
+          <w:szCs w:val="17"/>
+        </w:rPr>
+        <w:t xml:space="preserve">  Read and record the carbon concentration on the C2 analyser control panel.</w:t>
+      </w:r>
+    </w:p>
+    <w:p>
+      <w:pPr>
+        <w:ind w:left="280"/>
+        <w:spacing w:after="50" w:before="0" w:line="245"/>
+      </w:pPr>
+      <w:r>
+        <w:rPr>
+          <w:rFonts w:ascii="Calibri" w:cs="Calibri" w:eastAsia="Calibri" w:hAnsi="Calibri"/>
+          <w:b/>
+          <w:bCs/>
+          <w:sz w:val="17"/>
+          <w:szCs w:val="17"/>
+        </w:rPr>
+        <w:t xml:space="preserve">5.</w:t>
+      </w:r>
+      <w:r>
+        <w:rPr>
+          <w:rFonts w:ascii="Calibri" w:cs="Calibri" w:eastAsia="Calibri" w:hAnsi="Calibri"/>
+          <w:sz w:val="17"/>
+          <w:szCs w:val="17"/>
+        </w:rPr>
+        <w:t xml:space="preserve">  Wash the slurry off the carbon on the sieve with running water.</w:t>
+      </w:r>
+    </w:p>
+    <w:p>
+      <w:pPr>
+        <w:ind w:left="280"/>
+        <w:spacing w:after="50" w:before="0" w:line="245"/>
+      </w:pPr>
+      <w:r>
+        <w:rPr>
+          <w:rFonts w:ascii="Calibri" w:cs="Calibri" w:eastAsia="Calibri" w:hAnsi="Calibri"/>
+          <w:b/>
+          <w:bCs/>
+          <w:sz w:val="17"/>
+          <w:szCs w:val="17"/>
+        </w:rPr>
+        <w:t xml:space="preserve">6.</w:t>
+      </w:r>
+      <w:r>
+        <w:rPr>
+          <w:rFonts w:ascii="Calibri" w:cs="Calibri" w:eastAsia="Calibri" w:hAnsi="Calibri"/>
+          <w:sz w:val="17"/>
+          <w:szCs w:val="17"/>
+        </w:rPr>
+        <w:t xml:space="preserve">  Funnel the carbon into a 100 mL measuring cylinder. Rinse until no carbon is left on the funnel or sieve.</w:t>
+      </w:r>
+    </w:p>
+    <w:p>
+      <w:pPr>
+        <w:ind w:left="280"/>
+        <w:spacing w:after="50" w:before="0" w:line="245"/>
+      </w:pPr>
+      <w:r>
+        <w:rPr>
+          <w:rFonts w:ascii="Calibri" w:cs="Calibri" w:eastAsia="Calibri" w:hAnsi="Calibri"/>
+          <w:b/>
+          <w:bCs/>
+          <w:sz w:val="17"/>
+          <w:szCs w:val="17"/>
+        </w:rPr>
+        <w:t xml:space="preserve">7.</w:t>
+      </w:r>
+      <w:r>
+        <w:rPr>
+          <w:rFonts w:ascii="Calibri" w:cs="Calibri" w:eastAsia="Calibri" w:hAnsi="Calibri"/>
+          <w:sz w:val="17"/>
+          <w:szCs w:val="17"/>
+        </w:rPr>
+        <w:t xml:space="preserve">  Tap the cylinder to pack the carbon, then record the carbon volume.</w:t>
+      </w:r>
+    </w:p>
+    <w:p>
+      <w:pPr>
+        <w:ind w:left="280"/>
+        <w:spacing w:after="50" w:before="0" w:line="245"/>
+      </w:pPr>
+      <w:r>
+        <w:rPr>
+          <w:rFonts w:ascii="Calibri" w:cs="Calibri" w:eastAsia="Calibri" w:hAnsi="Calibri"/>
+          <w:b/>
+          <w:bCs/>
+          <w:sz w:val="17"/>
+          <w:szCs w:val="17"/>
+        </w:rPr>
+        <w:t xml:space="preserve">8.</w:t>
+      </w:r>
+      <w:r>
+        <w:rPr>
+          <w:rFonts w:ascii="Calibri" w:cs="Calibri" w:eastAsia="Calibri" w:hAnsi="Calibri"/>
+          <w:sz w:val="17"/>
+          <w:szCs w:val="17"/>
+        </w:rPr>
+        <w:t xml:space="preserve">  Carbon concentration (g/L) = carbon volume (mL) / (2 x number of scoops). [CONFIRM] this does not match the Part A calculation (0.47 g/mL x volume / sample volume). Dividing by 2 looks like a carbon density of about 0.5 g/mL with a 1 L scoop, but the scoop volume is not stated. Settle one calculation before use.</w:t>
+      </w:r>
+    </w:p>
+    <w:p>
+      <w:pPr>
+        <w:ind w:left="280"/>
+        <w:spacing w:after="50" w:before="0" w:line="245"/>
+      </w:pPr>
+      <w:r>
+        <w:rPr>
+          <w:rFonts w:ascii="Calibri" w:cs="Calibri" w:eastAsia="Calibri" w:hAnsi="Calibri"/>
+          <w:b/>
+          <w:bCs/>
+          <w:sz w:val="17"/>
+          <w:szCs w:val="17"/>
+        </w:rPr>
+        <w:t xml:space="preserve">9.</w:t>
+      </w:r>
+      <w:r>
+        <w:rPr>
+          <w:rFonts w:ascii="Calibri" w:cs="Calibri" w:eastAsia="Calibri" w:hAnsi="Calibri"/>
+          <w:sz w:val="17"/>
+          <w:szCs w:val="17"/>
+        </w:rPr>
+        <w:t xml:space="preserve">  Compare with the C2 reading. Source tolerance is 3 g/L for CIL tanks 13 to 7 and 1.5 g/L for CIL tanks 1 and 2. [CONFIRM] these are Martabe tank numbers; set tolerances for 032-TK-002 to 032-TK-006.</w:t>
+      </w:r>
+    </w:p>
+    <w:p>
+      <w:pPr>
+        <w:ind w:left="280"/>
+        <w:spacing w:after="50" w:before="0" w:line="245"/>
+      </w:pPr>
+      <w:r>
+        <w:rPr>
+          <w:rFonts w:ascii="Calibri" w:cs="Calibri" w:eastAsia="Calibri" w:hAnsi="Calibri"/>
+          <w:b/>
+          <w:bCs/>
+          <w:sz w:val="17"/>
+          <w:szCs w:val="17"/>
+        </w:rPr>
+        <w:t xml:space="preserve">10.</w:t>
+      </w:r>
+      <w:r>
+        <w:rPr>
+          <w:rFonts w:ascii="Calibri" w:cs="Calibri" w:eastAsia="Calibri" w:hAnsi="Calibri"/>
+          <w:sz w:val="17"/>
+          <w:szCs w:val="17"/>
+        </w:rPr>
+        <w:t xml:space="preserve">  If the difference is outside tolerance take 3 more samples. If still outside tolerance, adjust the C2 meter and sample again. If still outside, calibrate the C2 meter (Martabe 'WI Kalibrasi C2 Meter', not received).</w:t>
+      </w:r>
+    </w:p>
+    <w:p>
+      <w:pPr>
+        <w:ind w:left="280"/>
+        <w:spacing w:after="50" w:before="0" w:line="245"/>
+      </w:pPr>
+      <w:r>
+        <w:rPr>
+          <w:rFonts w:ascii="Calibri" w:cs="Calibri" w:eastAsia="Calibri" w:hAnsi="Calibri"/>
+          <w:b/>
+          <w:bCs/>
+          <w:sz w:val="17"/>
+          <w:szCs w:val="17"/>
+        </w:rPr>
+        <w:t xml:space="preserve">11.</w:t>
+      </w:r>
+      <w:r>
+        <w:rPr>
+          <w:rFonts w:ascii="Calibri" w:cs="Calibri" w:eastAsia="Calibri" w:hAnsi="Calibri"/>
+          <w:sz w:val="17"/>
+          <w:szCs w:val="17"/>
+        </w:rPr>
+        <w:t xml:space="preserve">  Put the carbon in a plastic bag and drain the water carried over. Close the bag tightly. Weigh the carbon with the bag for a more accurate result. [CONFIRM] bag tare is not stated.</w:t>
+      </w:r>
+    </w:p>
+    <w:p>
+      <w:pPr>
+        <w:ind w:left="280"/>
+        <w:spacing w:after="50" w:before="0" w:line="245"/>
+      </w:pPr>
+      <w:r>
+        <w:rPr>
+          <w:rFonts w:ascii="Calibri" w:cs="Calibri" w:eastAsia="Calibri" w:hAnsi="Calibri"/>
+          <w:b/>
+          <w:bCs/>
+          <w:sz w:val="17"/>
+          <w:szCs w:val="17"/>
+        </w:rPr>
+        <w:t xml:space="preserve">12.</w:t>
+      </w:r>
+      <w:r>
+        <w:rPr>
+          <w:rFonts w:ascii="Calibri" w:cs="Calibri" w:eastAsia="Calibri" w:hAnsi="Calibri"/>
+          <w:sz w:val="17"/>
+          <w:szCs w:val="17"/>
+        </w:rPr>
+        <w:t xml:space="preserve">  Record the result in 'G:\Processing\5. Metallurgy\Metallurgy Lab\04 Metlab Data\Carbon\Carbon Concentration C2'.</w:t>
       </w:r>
     </w:p>
     <w:p>
@@ -2689,6 +3177,24 @@
           <w:szCs w:val="17"/>
         </w:rPr>
         <w:t xml:space="preserve">HM-PRC-V01-PRO005 Carbon in Leach (CIL) Circuit</w:t>
+      </w:r>
+    </w:p>
+    <w:p>
+      <w:pPr>
+        <w:pStyle w:val="ListParagraph"/>
+        <w:numPr>
+          <w:ilvl w:val="0"/>
+          <w:numId w:val="1"/>
+        </w:numPr>
+        <w:spacing w:after="60" w:line="245"/>
+      </w:pPr>
+      <w:r>
+        <w:rPr>
+          <w:rFonts w:ascii="Calibri" w:cs="Calibri" w:eastAsia="Calibri" w:hAnsi="Calibri"/>
+          <w:sz w:val="17"/>
+          <w:szCs w:val="17"/>
+        </w:rPr>
+        <w:t xml:space="preserve">Martabe work instruction 'Carbon Analyser C2 Check' DOC-3-MET-PRS-WIN-00048-IE v1.0 (issued 25/12/2024; reference SOP DOC-2-MET-PRM-SOP-00037-IE) - Part B source</w:t>
       </w:r>
     </w:p>
     <w:sectPr>

</xml_diff>

<commit_message>
Add Martabe WIs batch 15 (NaOH titration, TPS cube calibration, C2 calibration, Marsh funnel)
Co-Authored-By: Claude Sonnet 5.5 <noreply@anthropic.com>
Claude-Session: https://claude.ai/code/session_0121qocWgsZdFAsne2oz9sHT
</commit_message>
<xml_diff>
--- a/SWI/201-Plant-Sampling/MM-4034-033-OR-03-SWI-PRO-MET-201-005-Carbon-Concentration-Measurement-in-CIL-Tanks-RevA.docx
+++ b/SWI/201-Plant-Sampling/MM-4034-033-OR-03-SWI-PRO-MET-201-005-Carbon-Concentration-Measurement-in-CIL-Tanks-RevA.docx
@@ -638,7 +638,7 @@
                 <w:sz w:val="17"/>
                 <w:szCs w:val="17"/>
               </w:rPr>
-              <w:t xml:space="preserve">DRAFT FOR REVIEW. Martabe work instruction 'Carbon Analyser C2 Check' (DOC-3-MET-PRS-WIN-00048-IE, v1.0, issued 25/12/2024) added as Section 6 Part B. Not approved until reviewed. JSEA JSEA-PRO-MET-201-005 must be updated for the added hazard row.</w:t>
+              <w:t xml:space="preserve">DRAFT FOR REVIEW. Martabe work instructions 'Carbon Analyser C2 Check' (DOC-3-MET-PRS-WIN-00048-IE) as Part B and 'C2 Meter Calibration' (DOC-3-MET-PMC-WIN-00111-IE) as Part C added to Section 6, both v1.0 issued 25/12/2024. Not approved until reviewed. JSEA JSEA-PRO-MET-201-005 must be updated for the added hazard row.</w:t>
             </w:r>
           </w:p>
         </w:tc>
@@ -1693,6 +1693,58 @@
           </w:p>
         </w:tc>
       </w:tr>
+      <w:tr>
+        <w:tc>
+          <w:tcPr>
+            <w:tcW w:type="dxa" w:w="2900"/>
+            <w:shd w:val="clear" w:color="auto" w:fill="F2F5FA"/>
+            <w:tcMar>
+              <w:top w:type="dxa" w:w="55"/>
+              <w:left w:type="dxa" w:w="85"/>
+              <w:bottom w:type="dxa" w:w="55"/>
+              <w:right w:type="dxa" w:w="85"/>
+            </w:tcMar>
+          </w:tcPr>
+          <w:p>
+            <w:pPr>
+              <w:spacing w:after="0" w:line="235"/>
+            </w:pPr>
+            <w:r>
+              <w:rPr>
+                <w:rFonts w:ascii="Calibri" w:cs="Calibri" w:eastAsia="Calibri" w:hAnsi="Calibri"/>
+                <w:sz w:val="16"/>
+                <w:szCs w:val="16"/>
+              </w:rPr>
+              <w:t xml:space="preserve">[JSEA to confirm] Lifting the C2 probe pole, moving equipment overhead, and slurry splash at the C2 probe</w:t>
+            </w:r>
+          </w:p>
+        </w:tc>
+        <w:tc>
+          <w:tcPr>
+            <w:tcW w:type="dxa" w:w="6126"/>
+            <w:shd w:val="clear" w:color="auto" w:fill="F2F5FA"/>
+            <w:tcMar>
+              <w:top w:type="dxa" w:w="55"/>
+              <w:left w:type="dxa" w:w="85"/>
+              <w:bottom w:type="dxa" w:w="55"/>
+              <w:right w:type="dxa" w:w="85"/>
+            </w:tcMar>
+          </w:tcPr>
+          <w:p>
+            <w:pPr>
+              <w:spacing w:after="0" w:line="235"/>
+            </w:pPr>
+            <w:r>
+              <w:rPr>
+                <w:rFonts w:ascii="Calibri" w:cs="Calibri" w:eastAsia="Calibri" w:hAnsi="Calibri"/>
+                <w:sz w:val="16"/>
+                <w:szCs w:val="16"/>
+              </w:rPr>
+              <w:t xml:space="preserve">Two people lift the probe pole; nothing moving overhead. Cloth or latex gloves, hard hat, glasses and safety boots. Eyewash proven flowing; wash splashes with soap under running water; keep clear of falling slurry. Hands clear of pinch points; correct manual handling and ergonomic posture; careful footing on wet floors.</w:t>
+            </w:r>
+          </w:p>
+        </w:tc>
+      </w:tr>
     </w:tbl>
     <w:p>
       <w:pPr>
@@ -2244,6 +2296,24 @@
     </w:p>
     <w:p>
       <w:pPr>
+        <w:pStyle w:val="ListParagraph"/>
+        <w:numPr>
+          <w:ilvl w:val="0"/>
+          <w:numId w:val="1"/>
+        </w:numPr>
+        <w:spacing w:after="60" w:line="245"/>
+      </w:pPr>
+      <w:r>
+        <w:rPr>
+          <w:rFonts w:ascii="Calibri" w:cs="Calibri" w:eastAsia="Calibri" w:hAnsi="Calibri"/>
+          <w:sz w:val="17"/>
+          <w:szCs w:val="17"/>
+        </w:rPr>
+        <w:t xml:space="preserve">[M] Part C: C2 probe with its panel, 20 L bucket of process water, carbon sieve basket (probe seal), flat screwdriver, Marcy scale</w:t>
+      </w:r>
+    </w:p>
+    <w:p>
+      <w:pPr>
         <w:pStyle w:val="Heading1"/>
         <w:spacing w:after="120" w:before="260"/>
       </w:pPr>
@@ -2861,7 +2931,7 @@
           <w:sz w:val="17"/>
           <w:szCs w:val="17"/>
         </w:rPr>
-        <w:t xml:space="preserve">  If the difference is outside tolerance take 3 more samples. If still outside tolerance, adjust the C2 meter and sample again. If still outside, calibrate the C2 meter (Martabe 'WI Kalibrasi C2 Meter', not received).</w:t>
+        <w:t xml:space="preserve">  If the difference is outside tolerance take 3 more samples. If still outside tolerance, adjust the C2 meter and sample again. If still outside, calibrate the C2 meter (Part C).</w:t>
       </w:r>
     </w:p>
     <w:p>
@@ -2910,6 +2980,337 @@
           <w:szCs w:val="17"/>
         </w:rPr>
         <w:t xml:space="preserve">  Record the result in 'G:\Processing\5. Metallurgy\Metallurgy Lab\04 Metlab Data\Carbon\Carbon Concentration C2'.</w:t>
+      </w:r>
+    </w:p>
+    <w:p>
+      <w:pPr>
+        <w:spacing w:after="90" w:before="180" w:line="245"/>
+        <w:keepNext/>
+      </w:pPr>
+      <w:r>
+        <w:rPr>
+          <w:rFonts w:ascii="Calibri" w:cs="Calibri" w:eastAsia="Calibri" w:hAnsi="Calibri"/>
+          <w:b/>
+          <w:bCs/>
+          <w:color w:val="1F3864"/>
+          <w:sz w:val="19"/>
+          <w:szCs w:val="19"/>
+        </w:rPr>
+        <w:t xml:space="preserve">Part C - C2 meter calibration [M]</w:t>
+      </w:r>
+    </w:p>
+    <w:p>
+      <w:pPr>
+        <w:spacing w:after="60" w:before="0" w:line="245"/>
+      </w:pPr>
+      <w:r>
+        <w:rPr>
+          <w:rFonts w:ascii="Calibri" w:cs="Calibri" w:eastAsia="Calibri" w:hAnsi="Calibri"/>
+          <w:sz w:val="17"/>
+          <w:szCs w:val="17"/>
+        </w:rPr>
+        <w:t xml:space="preserve">[M] = taken from the Martabe team work instruction "C2 Meter Calibration (DOC-3-MET-PMC-WIN-00111-IE)" (25/12/2024). [CONFIRM] = unspecified or inconsistent in the source; resolve before this instruction is approved for use. Parts A and B are unchanged.</w:t>
+      </w:r>
+    </w:p>
+    <w:p>
+      <w:pPr>
+        <w:spacing w:after="60" w:before="0" w:line="245"/>
+      </w:pPr>
+      <w:r>
+        <w:rPr>
+          <w:rFonts w:ascii="Calibri" w:cs="Calibri" w:eastAsia="Calibri" w:hAnsi="Calibri"/>
+          <w:sz w:val="17"/>
+          <w:szCs w:val="17"/>
+        </w:rPr>
+        <w:t xml:space="preserve">Purpose [M]: calibrate the C2 carbon meter when the Part B check is out of tolerance. [CONFIRM] the source gives expected ranges for the calibration constants (below); confirm they suit this plant's probe.</w:t>
+      </w:r>
+    </w:p>
+    <w:p>
+      <w:pPr>
+        <w:ind w:left="280"/>
+        <w:spacing w:after="50" w:before="0" w:line="245"/>
+      </w:pPr>
+      <w:r>
+        <w:rPr>
+          <w:rFonts w:ascii="Calibri" w:cs="Calibri" w:eastAsia="Calibri" w:hAnsi="Calibri"/>
+          <w:b/>
+          <w:bCs/>
+          <w:sz w:val="17"/>
+          <w:szCs w:val="17"/>
+        </w:rPr>
+        <w:t xml:space="preserve">13.</w:t>
+      </w:r>
+      <w:r>
+        <w:rPr>
+          <w:rFonts w:ascii="Calibri" w:cs="Calibri" w:eastAsia="Calibri" w:hAnsi="Calibri"/>
+          <w:sz w:val="17"/>
+          <w:szCs w:val="17"/>
+        </w:rPr>
+        <w:t xml:space="preserve">  Take 5 and prepare the sampler, 100 mL measuring cylinder, funnel, C2 carbon sieve basket, 20 L bucket, C2 meter, sieve, screwdriver and Marcy scale. Have process water and CIL slurry containing carbon ready [M].</w:t>
+      </w:r>
+    </w:p>
+    <w:p>
+      <w:pPr>
+        <w:ind w:left="280"/>
+        <w:spacing w:after="50" w:before="0" w:line="245"/>
+      </w:pPr>
+      <w:r>
+        <w:rPr>
+          <w:rFonts w:ascii="Calibri" w:cs="Calibri" w:eastAsia="Calibri" w:hAnsi="Calibri"/>
+          <w:b/>
+          <w:bCs/>
+          <w:sz w:val="17"/>
+          <w:szCs w:val="17"/>
+        </w:rPr>
+        <w:t xml:space="preserve">14.</w:t>
+      </w:r>
+      <w:r>
+        <w:rPr>
+          <w:rFonts w:ascii="Calibri" w:cs="Calibri" w:eastAsia="Calibri" w:hAnsi="Calibri"/>
+          <w:sz w:val="17"/>
+          <w:szCs w:val="17"/>
+        </w:rPr>
+        <w:t xml:space="preserve">  Pre-start: find the nearest safety shower and check it works. Ask the operator to stop the carbon transfer pump on the tank being checked. Make sure no HCN gas detector alarm is active near the work area (the source says below 10 ppm; use this SWI's 5 ppm alarm).</w:t>
+      </w:r>
+    </w:p>
+    <w:p>
+      <w:pPr>
+        <w:ind w:left="280"/>
+        <w:spacing w:after="50" w:before="0" w:line="245"/>
+      </w:pPr>
+      <w:r>
+        <w:rPr>
+          <w:rFonts w:ascii="Calibri" w:cs="Calibri" w:eastAsia="Calibri" w:hAnsi="Calibri"/>
+          <w:b/>
+          <w:bCs/>
+          <w:sz w:val="17"/>
+          <w:szCs w:val="17"/>
+        </w:rPr>
+        <w:t xml:space="preserve">15.</w:t>
+      </w:r>
+      <w:r>
+        <w:rPr>
+          <w:rFonts w:ascii="Calibri" w:cs="Calibri" w:eastAsia="Calibri" w:hAnsi="Calibri"/>
+          <w:sz w:val="17"/>
+          <w:szCs w:val="17"/>
+        </w:rPr>
+        <w:t xml:space="preserve">  Lift the C2 probe out of the tank. Two people must do the lift. Check the probe and clean off anything caught in it.</w:t>
+      </w:r>
+    </w:p>
+    <w:p>
+      <w:pPr>
+        <w:ind w:left="280"/>
+        <w:spacing w:after="50" w:before="0" w:line="245"/>
+      </w:pPr>
+      <w:r>
+        <w:rPr>
+          <w:rFonts w:ascii="Calibri" w:cs="Calibri" w:eastAsia="Calibri" w:hAnsi="Calibri"/>
+          <w:b/>
+          <w:bCs/>
+          <w:sz w:val="17"/>
+          <w:szCs w:val="17"/>
+        </w:rPr>
+        <w:t xml:space="preserve">16.</w:t>
+      </w:r>
+      <w:r>
+        <w:rPr>
+          <w:rFonts w:ascii="Calibri" w:cs="Calibri" w:eastAsia="Calibri" w:hAnsi="Calibri"/>
+          <w:sz w:val="17"/>
+          <w:szCs w:val="17"/>
+        </w:rPr>
+        <w:t xml:space="preserve">  On the panel main screen press F4 (settings), move to 'calibration' with F1 or F2 and select it with F3. Press F1 to open the calibration screen.</w:t>
+      </w:r>
+    </w:p>
+    <w:p>
+      <w:pPr>
+        <w:ind w:left="280"/>
+        <w:spacing w:after="50" w:before="0" w:line="245"/>
+      </w:pPr>
+      <w:r>
+        <w:rPr>
+          <w:rFonts w:ascii="Calibri" w:cs="Calibri" w:eastAsia="Calibri" w:hAnsi="Calibri"/>
+          <w:b/>
+          <w:bCs/>
+          <w:sz w:val="17"/>
+          <w:szCs w:val="17"/>
+        </w:rPr>
+        <w:t xml:space="preserve">17.</w:t>
+      </w:r>
+      <w:r>
+        <w:rPr>
+          <w:rFonts w:ascii="Calibri" w:cs="Calibri" w:eastAsia="Calibri" w:hAnsi="Calibri"/>
+          <w:sz w:val="17"/>
+          <w:szCs w:val="17"/>
+        </w:rPr>
+        <w:t xml:space="preserve">  Tick 'Bypass Water Calibration' only if the probe is thought to be damaged or it is a new probe: attenuation in water seldom changes between calibrations.</w:t>
+      </w:r>
+    </w:p>
+    <w:p>
+      <w:pPr>
+        <w:ind w:left="280"/>
+        <w:spacing w:after="50" w:before="0" w:line="245"/>
+      </w:pPr>
+      <w:r>
+        <w:rPr>
+          <w:rFonts w:ascii="Calibri" w:cs="Calibri" w:eastAsia="Calibri" w:hAnsi="Calibri"/>
+          <w:b/>
+          <w:bCs/>
+          <w:sz w:val="17"/>
+          <w:szCs w:val="17"/>
+        </w:rPr>
+        <w:t xml:space="preserve">18.</w:t>
+      </w:r>
+      <w:r>
+        <w:rPr>
+          <w:rFonts w:ascii="Calibri" w:cs="Calibri" w:eastAsia="Calibri" w:hAnsi="Calibri"/>
+          <w:sz w:val="17"/>
+          <w:szCs w:val="17"/>
+        </w:rPr>
+        <w:t xml:space="preserve">  Take 3 slurry samples near the probe. Find the carbon concentration (g/L) by the manual method in Part B, and the slurry density with the Marcy scale.</w:t>
+      </w:r>
+    </w:p>
+    <w:p>
+      <w:pPr>
+        <w:ind w:left="280"/>
+        <w:spacing w:after="50" w:before="0" w:line="245"/>
+      </w:pPr>
+      <w:r>
+        <w:rPr>
+          <w:rFonts w:ascii="Calibri" w:cs="Calibri" w:eastAsia="Calibri" w:hAnsi="Calibri"/>
+          <w:b/>
+          <w:bCs/>
+          <w:sz w:val="17"/>
+          <w:szCs w:val="17"/>
+        </w:rPr>
+        <w:t xml:space="preserve">19.</w:t>
+      </w:r>
+      <w:r>
+        <w:rPr>
+          <w:rFonts w:ascii="Calibri" w:cs="Calibri" w:eastAsia="Calibri" w:hAnsi="Calibri"/>
+          <w:sz w:val="17"/>
+          <w:szCs w:val="17"/>
+        </w:rPr>
+        <w:t xml:space="preserve">  Water sensitivity (when not bypassing): put the probe in the 20 L bucket of process water and press F1. The meter finds the attenuation in water (dB).</w:t>
+      </w:r>
+    </w:p>
+    <w:p>
+      <w:pPr>
+        <w:ind w:left="280"/>
+        <w:spacing w:after="50" w:before="0" w:line="245"/>
+      </w:pPr>
+      <w:r>
+        <w:rPr>
+          <w:rFonts w:ascii="Calibri" w:cs="Calibri" w:eastAsia="Calibri" w:hAnsi="Calibri"/>
+          <w:b/>
+          <w:bCs/>
+          <w:sz w:val="17"/>
+          <w:szCs w:val="17"/>
+        </w:rPr>
+        <w:t xml:space="preserve">20.</w:t>
+      </w:r>
+      <w:r>
+        <w:rPr>
+          <w:rFonts w:ascii="Calibri" w:cs="Calibri" w:eastAsia="Calibri" w:hAnsi="Calibri"/>
+          <w:sz w:val="17"/>
+          <w:szCs w:val="17"/>
+        </w:rPr>
+        <w:t xml:space="preserve">  Slurry density sensitivity: take the probe out of the bucket and put it in the carbon sieve basket, with the seal fitted. Put the probe back in the tank and press F1. The meter finds the attenuation due to the slurry. Enter the relative density (RD) you measured.</w:t>
+      </w:r>
+    </w:p>
+    <w:p>
+      <w:pPr>
+        <w:ind w:left="280"/>
+        <w:spacing w:after="50" w:before="0" w:line="245"/>
+      </w:pPr>
+      <w:r>
+        <w:rPr>
+          <w:rFonts w:ascii="Calibri" w:cs="Calibri" w:eastAsia="Calibri" w:hAnsi="Calibri"/>
+          <w:b/>
+          <w:bCs/>
+          <w:sz w:val="17"/>
+          <w:szCs w:val="17"/>
+        </w:rPr>
+        <w:t xml:space="preserve">21.</w:t>
+      </w:r>
+      <w:r>
+        <w:rPr>
+          <w:rFonts w:ascii="Calibri" w:cs="Calibri" w:eastAsia="Calibri" w:hAnsi="Calibri"/>
+          <w:sz w:val="17"/>
+          <w:szCs w:val="17"/>
+        </w:rPr>
+        <w:t xml:space="preserve">  Carbon sensitivity: take the probe out, wash off the slurry with water, drain it by hanging it briefly on the handrail, and take it out of the basket. Put it back in the tank and press F1. The meter finds the attenuation due to slurry and carbon. Enter the average carbon concentration (CC) you measured.</w:t>
+      </w:r>
+    </w:p>
+    <w:p>
+      <w:pPr>
+        <w:ind w:left="280"/>
+        <w:spacing w:after="50" w:before="0" w:line="245"/>
+      </w:pPr>
+      <w:r>
+        <w:rPr>
+          <w:rFonts w:ascii="Calibri" w:cs="Calibri" w:eastAsia="Calibri" w:hAnsi="Calibri"/>
+          <w:b/>
+          <w:bCs/>
+          <w:sz w:val="17"/>
+          <w:szCs w:val="17"/>
+        </w:rPr>
+        <w:t xml:space="preserve">22.</w:t>
+      </w:r>
+      <w:r>
+        <w:rPr>
+          <w:rFonts w:ascii="Calibri" w:cs="Calibri" w:eastAsia="Calibri" w:hAnsi="Calibri"/>
+          <w:sz w:val="17"/>
+          <w:szCs w:val="17"/>
+        </w:rPr>
+        <w:t xml:space="preserve">  The meter generates a new set of constants. Press F1 to accept them or F4 to reject them. Expected values in the source: water attenuation (ATTO) 9 to 15 dB, Mrd 20 to 50, Mcc 0.3 to 0.8. [CONFIRM] the plus or minus figures in the source (12 dB, 40, 0.60) are unclear.</w:t>
+      </w:r>
+    </w:p>
+    <w:p>
+      <w:pPr>
+        <w:ind w:left="280"/>
+        <w:spacing w:after="50" w:before="0" w:line="245"/>
+      </w:pPr>
+      <w:r>
+        <w:rPr>
+          <w:rFonts w:ascii="Calibri" w:cs="Calibri" w:eastAsia="Calibri" w:hAnsi="Calibri"/>
+          <w:b/>
+          <w:bCs/>
+          <w:sz w:val="17"/>
+          <w:szCs w:val="17"/>
+        </w:rPr>
+        <w:t xml:space="preserve">23.</w:t>
+      </w:r>
+      <w:r>
+        <w:rPr>
+          <w:rFonts w:ascii="Calibri" w:cs="Calibri" w:eastAsia="Calibri" w:hAnsi="Calibri"/>
+          <w:sz w:val="17"/>
+          <w:szCs w:val="17"/>
+        </w:rPr>
+        <w:t xml:space="preserve">  If rejected, the previous constants stay and the new ones are lost. If accepted, the new constants replace the old ones, which are kept on the calibration screen for reference.</w:t>
+      </w:r>
+    </w:p>
+    <w:p>
+      <w:pPr>
+        <w:ind w:left="280"/>
+        <w:spacing w:after="50" w:before="0" w:line="245"/>
+      </w:pPr>
+      <w:r>
+        <w:rPr>
+          <w:rFonts w:ascii="Calibri" w:cs="Calibri" w:eastAsia="Calibri" w:hAnsi="Calibri"/>
+          <w:b/>
+          <w:bCs/>
+          <w:sz w:val="17"/>
+          <w:szCs w:val="17"/>
+        </w:rPr>
+        <w:t xml:space="preserve">24.</w:t>
+      </w:r>
+      <w:r>
+        <w:rPr>
+          <w:rFonts w:ascii="Calibri" w:cs="Calibri" w:eastAsia="Calibri" w:hAnsi="Calibri"/>
+          <w:sz w:val="17"/>
+          <w:szCs w:val="17"/>
+        </w:rPr>
+        <w:t xml:space="preserve">  Record the C2 readings before and after calibration in 'G:\Processing\5. Metallurgy\Metallurgy Lab\04 Metlab Data\Calibration Logsheet\Logsheet C2 Meter Calibration' or on form DOC-4-MET-PMC-DFR-00132-EN (Form C2 Meter Calibration.xlsx).</w:t>
       </w:r>
     </w:p>
     <w:p>
@@ -3195,6 +3596,24 @@
           <w:szCs w:val="17"/>
         </w:rPr>
         <w:t xml:space="preserve">Martabe work instruction 'Carbon Analyser C2 Check' DOC-3-MET-PRS-WIN-00048-IE v1.0 (issued 25/12/2024; reference SOP DOC-2-MET-PRM-SOP-00037-IE) - Part B source</w:t>
+      </w:r>
+    </w:p>
+    <w:p>
+      <w:pPr>
+        <w:pStyle w:val="ListParagraph"/>
+        <w:numPr>
+          <w:ilvl w:val="0"/>
+          <w:numId w:val="1"/>
+        </w:numPr>
+        <w:spacing w:after="60" w:line="245"/>
+      </w:pPr>
+      <w:r>
+        <w:rPr>
+          <w:rFonts w:ascii="Calibri" w:cs="Calibri" w:eastAsia="Calibri" w:hAnsi="Calibri"/>
+          <w:sz w:val="17"/>
+          <w:szCs w:val="17"/>
+        </w:rPr>
+        <w:t xml:space="preserve">Martabe work instruction 'C2 Meter Calibration' DOC-3-MET-PMC-WIN-00111-IE v1.0 (issued 25/12/2024) - Part C source</w:t>
       </w:r>
     </w:p>
     <w:sectPr>

</xml_diff>

<commit_message>
201-005: remove Martabe C2 parts (no C2 analyser at plant), keep Mt. Morgan method
Co-Authored-By: Claude Sonnet 5.5 <noreply@anthropic.com>
Claude-Session: https://claude.ai/code/session_01UHnSDEBA56GANs2gfXuK2P
</commit_message>
<xml_diff>
--- a/SWI/201-Plant-Sampling/MM-4034-033-OR-03-SWI-PRO-MET-201-005-Carbon-Concentration-Measurement-in-CIL-Tanks-RevA.docx
+++ b/SWI/201-Plant-Sampling/MM-4034-033-OR-03-SWI-PRO-MET-201-005-Carbon-Concentration-Measurement-in-CIL-Tanks-RevA.docx
@@ -1908,21 +1908,6 @@
                 <w:szCs w:val="20"/>
               </w:rPr>
             </w:pPr>
-            <w:r>
-              <w:rPr>
-                <w:sz w:val="20"/>
-                <w:szCs w:val="20"/>
-              </w:rPr>
-              <w:t xml:space="preserve">Check the carbon analyser (C2) reading against a manual carbon measurement on the same tank, and calibrate the C2 meter when the check is out of tolerance.</w:t>
-            </w:r>
-          </w:p>
-          <w:p>
-            <w:pPr>
-              <w:rPr>
-                <w:sz w:val="20"/>
-                <w:szCs w:val="20"/>
-              </w:rPr>
-            </w:pPr>
           </w:p>
           <w:p>
             <w:pPr>
@@ -2036,35 +2021,20 @@
                 <w:szCs w:val="20"/>
               </w:rPr>
             </w:pPr>
-            <w:r>
-              <w:rPr>
-                <w:sz w:val="20"/>
-                <w:szCs w:val="20"/>
-              </w:rPr>
-              <w:t xml:space="preserve">Carbon analyser (C2) control panel and C2 probe</w:t>
-            </w:r>
-          </w:p>
-          <w:p>
-            <w:pPr>
-              <w:rPr>
-                <w:sz w:val="20"/>
-                <w:szCs w:val="20"/>
-              </w:rPr>
-            </w:pPr>
-          </w:p>
-          <w:p>
-            <w:pPr>
-              <w:rPr>
-                <w:sz w:val="20"/>
-                <w:szCs w:val="20"/>
-              </w:rPr>
-            </w:pPr>
-            <w:r>
-              <w:rPr>
-                <w:sz w:val="20"/>
-                <w:szCs w:val="20"/>
-              </w:rPr>
-              <w:t xml:space="preserve">Frequency: Once per shift on every tank. Frequency of the C2 check: to be set.</w:t>
+          </w:p>
+          <w:p>
+            <w:pPr>
+              <w:rPr>
+                <w:sz w:val="20"/>
+                <w:szCs w:val="20"/>
+              </w:rPr>
+            </w:pPr>
+            <w:r>
+              <w:rPr>
+                <w:sz w:val="20"/>
+                <w:szCs w:val="20"/>
+              </w:rPr>
+              <w:t xml:space="preserve">Frequency: Once per shift on every tank.</w:t>
             </w:r>
           </w:p>
           <w:p>
@@ -2111,48 +2081,6 @@
                 <w:szCs w:val="20"/>
               </w:rPr>
               <w:t xml:space="preserve">Register line: SWI-PRO-MET-201-005 in HM-MMM-WHS-REG-XXX-R00-SWI-SWMS, tab SWI-MET. The matching hazard analysis is JSEA-PRO-MET-201-005.</w:t>
-            </w:r>
-          </w:p>
-          <w:p>
-            <w:pPr>
-              <w:rPr>
-                <w:sz w:val="20"/>
-                <w:szCs w:val="20"/>
-              </w:rPr>
-            </w:pPr>
-          </w:p>
-          <w:p>
-            <w:pPr>
-              <w:rPr>
-                <w:sz w:val="20"/>
-                <w:szCs w:val="20"/>
-              </w:rPr>
-            </w:pPr>
-            <w:r>
-              <w:rPr>
-                <w:b/>
-                <w:bCs/>
-                <w:sz w:val="20"/>
-                <w:szCs w:val="20"/>
-              </w:rPr>
-              <w:t xml:space="preserve">Draft for review: the C2 check (Step 4) and the C2 meter calibration (Step 5) are taken from the Martabe work instructions Carbon Analyser C2 Check (DOC-3-MET-PRS-WIN-00048-IE) and C2 Meter Calibration (DOC-3-MET-PMC-WIN-00111-IE), both v1.0, 25/12/2024. JSEA-PRO-MET-201-005 must be updated for the added hazards before this instruction is approved.</w:t>
-            </w:r>
-          </w:p>
-          <w:p>
-            <w:pPr>
-              <w:rPr>
-                <w:sz w:val="20"/>
-                <w:szCs w:val="20"/>
-              </w:rPr>
-            </w:pPr>
-            <w:r>
-              <w:rPr>
-                <w:b/>
-                <w:bCs/>
-                <w:sz w:val="20"/>
-                <w:szCs w:val="20"/>
-              </w:rPr>
-              <w:t xml:space="preserve">Open items to resolve before approval: (1) confirm a C2 analyser is fitted at this plant and which tanks it covers; (2) settle one carbon concentration calculation - Step 3 and Step 4 differ; (3) set C2 tolerances for 032-TK-002 to 032-TK-006, the Martabe values use Martabe tank numbers; (4) bag tare for the weighed carbon is not stated; (5) the plus or minus figures for the calibration constants are unclear in the source; (6) confirm the record folders exist at Mt. Morgan.</w:t>
             </w:r>
           </w:p>
           <w:p>
@@ -2373,52 +2301,6 @@
                 <w:szCs w:val="20"/>
               </w:rPr>
               <w:t xml:space="preserve">Cross-contamination from a container or cutter not cleaned between points — Bucket, container, cutter and sieve rinsed with process water and then with the stream being sampled, and the rinse discarded, before every sample. Dedicated containers for high-grade streams. Labels checked against the schedule before handover.</w:t>
-            </w:r>
-          </w:p>
-          <w:p>
-            <w:pPr>
-              <w:rPr>
-                <w:sz w:val="20"/>
-                <w:szCs w:val="20"/>
-              </w:rPr>
-            </w:pPr>
-          </w:p>
-          <w:p>
-            <w:pPr>
-              <w:rPr>
-                <w:sz w:val="20"/>
-                <w:szCs w:val="20"/>
-              </w:rPr>
-            </w:pPr>
-            <w:r>
-              <w:rPr>
-                <w:sz w:val="20"/>
-                <w:szCs w:val="20"/>
-              </w:rPr>
-              <w:t xml:space="preserve">[JSEA to confirm] Pinch point at the sampling point cover and the bucket sampler — Close the sampling point cover slowly and keep hands clear of the pinch point. Watch the position of the bucket sampler. Pour slurry slowly. Eyewash proven flowing. HCN controls as above: fixed monitor working, pH probe correctly placed, solution kept above pH 10.5.</w:t>
-            </w:r>
-          </w:p>
-          <w:p>
-            <w:pPr>
-              <w:rPr>
-                <w:sz w:val="20"/>
-                <w:szCs w:val="20"/>
-              </w:rPr>
-            </w:pPr>
-          </w:p>
-          <w:p>
-            <w:pPr>
-              <w:rPr>
-                <w:sz w:val="20"/>
-                <w:szCs w:val="20"/>
-              </w:rPr>
-            </w:pPr>
-            <w:r>
-              <w:rPr>
-                <w:sz w:val="20"/>
-                <w:szCs w:val="20"/>
-              </w:rPr>
-              <w:t xml:space="preserve">[JSEA to confirm] Lifting the C2 probe pole, moving equipment overhead, and slurry splash at the C2 probe — Two people lift the probe pole; nothing moving overhead. Cloth or latex gloves, hard hat, glasses and safety boots. Eyewash proven flowing; wash splashes with soap under running water; keep clear of falling slurry. Hands clear of pinch points; correct manual handling and ergonomic posture; careful footing on wet floors.</w:t>
             </w:r>
           </w:p>
           <w:p>
@@ -3733,7 +3615,7 @@
                 <w:sz w:val="16"/>
                 <w:szCs w:val="16"/>
               </w:rPr>
-              <w:t xml:space="preserve">Equipment damaged or not in good condition</w:t>
+              <w:t xml:space="preserve">Cutter or container carrying carbon from the previous point</w:t>
             </w:r>
           </w:p>
         </w:tc>
@@ -3871,7 +3753,7 @@
                 <w:lang w:val="en-AU" w:eastAsia="en-AU"/>
                 <w14:ligatures w14:val="none"/>
               </w:rPr>
-              <w:t xml:space="preserve">Take 5 minutes before starting (Take 5) to think through the task, each risk and the controls needed. Confirm all controls in Part 2 are in place and the equipment is in good condition. If not, stop and report to the Met Lab supervisor, leading hand or metallurgist.</w:t>
+              <w:t xml:space="preserve">Confirm the plant is in steady-state operation - normal operation for a minimum of 15 to 20 minutes before sampling. A sample taken during a swing is not representative.</w:t>
             </w:r>
           </w:p>
           <w:p>
@@ -3915,7 +3797,7 @@
                 <w:lang w:val="en-AU" w:eastAsia="en-AU"/>
                 <w14:ligatures w14:val="none"/>
               </w:rPr>
-              <w:t xml:space="preserve">Confirm the plant is in steady-state operation - normal operation for a minimum of 15 to 20 minutes before sampling. A sample taken during a swing is not representative.</w:t>
+              <w:t xml:space="preserve">Notify the control room or DCS operator that the sampling round is starting, and which points it covers.</w:t>
             </w:r>
           </w:p>
           <w:p>
@@ -3959,7 +3841,7 @@
                 <w:lang w:val="en-AU" w:eastAsia="en-AU"/>
                 <w14:ligatures w14:val="none"/>
               </w:rPr>
-              <w:t xml:space="preserve">Notify the control room or DCS operator that the sampling round is starting, and which points it covers.</w:t>
+              <w:t xml:space="preserve">Confirm the personal gas monitor is on, in calibration date and reading clean, and that fixed detection in the area is healthy.</w:t>
             </w:r>
           </w:p>
           <w:p>
@@ -4003,7 +3885,7 @@
                 <w:lang w:val="en-AU" w:eastAsia="en-AU"/>
                 <w14:ligatures w14:val="none"/>
               </w:rPr>
-              <w:t xml:space="preserve">Confirm the personal gas monitor is on, in calibration date and reading clean, and that fixed detection in the area is healthy.</w:t>
+              <w:t xml:space="preserve">Confirm the safety shower and eyewash nearest the point are within reach and proven flowing.</w:t>
             </w:r>
           </w:p>
           <w:p>
@@ -4047,7 +3929,7 @@
                 <w:lang w:val="en-AU" w:eastAsia="en-AU"/>
                 <w14:ligatures w14:val="none"/>
               </w:rPr>
-              <w:t xml:space="preserve">Confirm the safety shower and eyewash nearest the point are within reach and proven flowing.</w:t>
+              <w:t xml:space="preserve">Confirm the sample cutter and container are clean and free of carbon from the previous point - flush with process water.</w:t>
             </w:r>
           </w:p>
           <w:p>
@@ -4091,50 +3973,6 @@
                 <w:lang w:val="en-AU" w:eastAsia="en-AU"/>
                 <w14:ligatures w14:val="none"/>
               </w:rPr>
-              <w:t xml:space="preserve">Confirm the sample cutter and container are clean and free of carbon from the previous point - flush with process water.</w:t>
-            </w:r>
-          </w:p>
-          <w:p>
-            <w:pPr>
-              <w:pStyle w:val="ListParagraph"/>
-              <w:spacing w:before="100" w:beforeAutospacing="1" w:after="100" w:afterAutospacing="1"/>
-              <w:ind w:left="360"/>
-              <w:rPr>
-                <w:rFonts w:eastAsia="Times New Roman" w:cs="Times New Roman"/>
-                <w:kern w:val="0"/>
-                <w:sz w:val="16"/>
-                <w:szCs w:val="16"/>
-                <w:lang w:val="en-AU" w:eastAsia="en-AU"/>
-                <w14:ligatures w14:val="none"/>
-              </w:rPr>
-            </w:pPr>
-          </w:p>
-          <w:p>
-            <w:pPr>
-              <w:pStyle w:val="ListParagraph"/>
-              <w:numPr>
-                <w:ilvl w:val="0"/>
-                <w:numId w:val="4"/>
-              </w:numPr>
-              <w:spacing w:before="100" w:beforeAutospacing="1" w:after="100" w:afterAutospacing="1"/>
-              <w:rPr>
-                <w:rFonts w:eastAsia="Times New Roman" w:cs="Times New Roman"/>
-                <w:kern w:val="0"/>
-                <w:sz w:val="16"/>
-                <w:szCs w:val="16"/>
-                <w:lang w:val="en-AU" w:eastAsia="en-AU"/>
-                <w14:ligatures w14:val="none"/>
-              </w:rPr>
-            </w:pPr>
-            <w:r>
-              <w:rPr>
-                <w:rFonts w:eastAsia="Times New Roman" w:cs="Times New Roman"/>
-                <w:kern w:val="0"/>
-                <w:sz w:val="16"/>
-                <w:szCs w:val="16"/>
-                <w:lang w:val="en-AU" w:eastAsia="en-AU"/>
-                <w14:ligatures w14:val="none"/>
-              </w:rPr>
               <w:t xml:space="preserve">Label every container BEFORE sampling - point, date, time and shift.</w:t>
             </w:r>
           </w:p>
@@ -4342,102 +4180,6 @@
                 <w14:ligatures w14:val="none"/>
               </w:rPr>
               <w:t xml:space="preserve">Process water hose for flushing</w:t>
-            </w:r>
-          </w:p>
-          <w:p>
-            <w:pPr>
-              <w:pStyle w:val="ListParagraph"/>
-              <w:numPr>
-                <w:ilvl w:val="0"/>
-                <w:numId w:val="14"/>
-              </w:numPr>
-              <w:rPr>
-                <w:rFonts w:eastAsia="Times New Roman" w:cs="Times New Roman"/>
-                <w:i/>
-                <w:iCs/>
-                <w:kern w:val="0"/>
-                <w:sz w:val="16"/>
-                <w:szCs w:val="16"/>
-                <w:lang w:val="en-AU" w:eastAsia="en-AU"/>
-                <w14:ligatures w14:val="none"/>
-              </w:rPr>
-            </w:pPr>
-            <w:r>
-              <w:rPr>
-                <w:rFonts w:eastAsia="Times New Roman" w:cs="Times New Roman"/>
-                <w:i/>
-                <w:iCs/>
-                <w:kern w:val="0"/>
-                <w:sz w:val="16"/>
-                <w:szCs w:val="16"/>
-                <w:lang w:val="en-AU" w:eastAsia="en-AU"/>
-                <w14:ligatures w14:val="none"/>
-              </w:rPr>
-              <w:t xml:space="preserve">Bucket sampler for the CIL tank sampling point, sieve, funnel, 100 mL measuring cylinder, plastic bags</w:t>
-            </w:r>
-          </w:p>
-          <w:p>
-            <w:pPr>
-              <w:pStyle w:val="ListParagraph"/>
-              <w:numPr>
-                <w:ilvl w:val="0"/>
-                <w:numId w:val="14"/>
-              </w:numPr>
-              <w:rPr>
-                <w:rFonts w:eastAsia="Times New Roman" w:cs="Times New Roman"/>
-                <w:i/>
-                <w:iCs/>
-                <w:kern w:val="0"/>
-                <w:sz w:val="16"/>
-                <w:szCs w:val="16"/>
-                <w:lang w:val="en-AU" w:eastAsia="en-AU"/>
-                <w14:ligatures w14:val="none"/>
-              </w:rPr>
-            </w:pPr>
-            <w:r>
-              <w:rPr>
-                <w:rFonts w:eastAsia="Times New Roman" w:cs="Times New Roman"/>
-                <w:i/>
-                <w:iCs/>
-                <w:kern w:val="0"/>
-                <w:sz w:val="16"/>
-                <w:szCs w:val="16"/>
-                <w:lang w:val="en-AU" w:eastAsia="en-AU"/>
-                <w14:ligatures w14:val="none"/>
-              </w:rPr>
-              <w:t xml:space="preserve">Carbon analyser (C2) control panel and the C2 calibration instruction</w:t>
-            </w:r>
-          </w:p>
-          <w:p>
-            <w:pPr>
-              <w:pStyle w:val="ListParagraph"/>
-              <w:numPr>
-                <w:ilvl w:val="0"/>
-                <w:numId w:val="14"/>
-              </w:numPr>
-              <w:rPr>
-                <w:rFonts w:eastAsia="Times New Roman" w:cs="Times New Roman"/>
-                <w:i/>
-                <w:iCs/>
-                <w:kern w:val="0"/>
-                <w:sz w:val="16"/>
-                <w:szCs w:val="16"/>
-                <w:lang w:val="en-AU" w:eastAsia="en-AU"/>
-                <w14:ligatures w14:val="none"/>
-              </w:rPr>
-            </w:pPr>
-            <w:r>
-              <w:rPr>
-                <w:rFonts w:eastAsia="Times New Roman" w:cs="Times New Roman"/>
-                <w:i/>
-                <w:iCs/>
-                <w:kern w:val="0"/>
-                <w:sz w:val="16"/>
-                <w:szCs w:val="16"/>
-                <w:lang w:val="en-AU" w:eastAsia="en-AU"/>
-                <w14:ligatures w14:val="none"/>
-              </w:rPr>
-              <w:t xml:space="preserve">C2 probe with its panel, 20 L bucket of process water, carbon sieve basket (probe seal), flat screwdriver, Marcy scale</w:t>
             </w:r>
           </w:p>
           <w:p>
@@ -5330,7 +5072,7 @@
                 <w:sz w:val="16"/>
                 <w:szCs w:val="16"/>
               </w:rPr>
-              <w:t xml:space="preserve">C2 Analyser Check Against the Manual Result</w:t>
+              <w:t xml:space="preserve">Completion and Clean Up</w:t>
             </w:r>
           </w:p>
           <w:p>
@@ -5361,7 +5103,7 @@
                 <w:sz w:val="16"/>
                 <w:szCs w:val="16"/>
               </w:rPr>
-              <w:t xml:space="preserve">Pinch point at the sampling point cover and bucket sampler</w:t>
+              <w:t xml:space="preserve">Sample valve left weeping</w:t>
             </w:r>
           </w:p>
           <w:p>
@@ -5393,7 +5135,7 @@
                 <w:sz w:val="16"/>
                 <w:szCs w:val="16"/>
               </w:rPr>
-              <w:t xml:space="preserve">HCN released at the sampling point</w:t>
+              <w:t xml:space="preserve">Samples not handed over with a signed record</w:t>
             </w:r>
           </w:p>
           <w:p>
@@ -5413,1558 +5155,6 @@
               <w:numPr>
                 <w:ilvl w:val="0"/>
                 <w:numId w:val="18"/>
-              </w:numPr>
-              <w:rPr>
-                <w:sz w:val="16"/>
-                <w:szCs w:val="16"/>
-                <w:lang w:val="en-AU"/>
-              </w:rPr>
-            </w:pPr>
-            <w:r>
-              <w:rPr>
-                <w:sz w:val="16"/>
-                <w:szCs w:val="16"/>
-              </w:rPr>
-              <w:t xml:space="preserve">Splash of slurry</w:t>
-            </w:r>
-          </w:p>
-          <w:p>
-            <w:pPr>
-              <w:pStyle w:val="ListParagraph"/>
-              <w:ind w:left="360"/>
-              <w:rPr>
-                <w:sz w:val="16"/>
-                <w:szCs w:val="16"/>
-                <w:lang w:val="en-AU"/>
-              </w:rPr>
-            </w:pPr>
-          </w:p>
-          <w:p>
-            <w:pPr>
-              <w:pStyle w:val="ListParagraph"/>
-              <w:numPr>
-                <w:ilvl w:val="0"/>
-                <w:numId w:val="18"/>
-              </w:numPr>
-              <w:rPr>
-                <w:sz w:val="16"/>
-                <w:szCs w:val="16"/>
-                <w:lang w:val="en-AU"/>
-              </w:rPr>
-            </w:pPr>
-            <w:r>
-              <w:rPr>
-                <w:sz w:val="16"/>
-                <w:szCs w:val="16"/>
-              </w:rPr>
-              <w:t xml:space="preserve">Calculation differs from Step 3</w:t>
-            </w:r>
-          </w:p>
-        </w:tc>
-        <w:tc>
-          <w:tcPr>
-            <w:tcW w:w="3998" w:type="dxa"/>
-            <w:gridSpan w:val="7"/>
-          </w:tcPr>
-          <w:p>
-            <w:pPr>
-              <w:pStyle w:val="ListParagraph"/>
-              <w:spacing w:before="100" w:beforeAutospacing="1" w:after="100" w:afterAutospacing="1"/>
-              <w:ind w:left="360"/>
-              <w:rPr>
-                <w:rFonts w:eastAsia="Times New Roman" w:cs="Times New Roman"/>
-                <w:kern w:val="0"/>
-                <w:sz w:val="16"/>
-                <w:szCs w:val="16"/>
-                <w:lang w:val="en-AU" w:eastAsia="en-AU"/>
-                <w14:ligatures w14:val="none"/>
-              </w:rPr>
-            </w:pPr>
-          </w:p>
-          <w:p>
-            <w:pPr>
-              <w:pStyle w:val="ListParagraph"/>
-              <w:numPr>
-                <w:ilvl w:val="0"/>
-                <w:numId w:val="4"/>
-              </w:numPr>
-              <w:spacing w:before="100" w:beforeAutospacing="1" w:after="100" w:afterAutospacing="1"/>
-              <w:rPr>
-                <w:rFonts w:eastAsia="Times New Roman" w:cs="Times New Roman"/>
-                <w:kern w:val="0"/>
-                <w:sz w:val="16"/>
-                <w:szCs w:val="16"/>
-                <w:lang w:val="en-AU" w:eastAsia="en-AU"/>
-                <w14:ligatures w14:val="none"/>
-              </w:rPr>
-            </w:pPr>
-            <w:r>
-              <w:rPr>
-                <w:rFonts w:eastAsia="Times New Roman" w:cs="Times New Roman"/>
-                <w:kern w:val="0"/>
-                <w:sz w:val="16"/>
-                <w:szCs w:val="16"/>
-                <w:lang w:val="en-AU" w:eastAsia="en-AU"/>
-                <w14:ligatures w14:val="none"/>
-              </w:rPr>
-              <w:t xml:space="preserve">Put the bucket sampler through the sampling point into the tank and take a sample from each CIL tank. Fill the bucket, then lift it slowly. Take 2 samples (scoops) per tank.</w:t>
-            </w:r>
-          </w:p>
-          <w:p>
-            <w:pPr>
-              <w:pStyle w:val="ListParagraph"/>
-              <w:spacing w:before="100" w:beforeAutospacing="1" w:after="100" w:afterAutospacing="1"/>
-              <w:ind w:left="360"/>
-              <w:rPr>
-                <w:rFonts w:eastAsia="Times New Roman" w:cs="Times New Roman"/>
-                <w:kern w:val="0"/>
-                <w:sz w:val="16"/>
-                <w:szCs w:val="16"/>
-                <w:lang w:val="en-AU" w:eastAsia="en-AU"/>
-                <w14:ligatures w14:val="none"/>
-              </w:rPr>
-            </w:pPr>
-          </w:p>
-          <w:p>
-            <w:pPr>
-              <w:pStyle w:val="ListParagraph"/>
-              <w:numPr>
-                <w:ilvl w:val="0"/>
-                <w:numId w:val="4"/>
-              </w:numPr>
-              <w:spacing w:before="100" w:beforeAutospacing="1" w:after="100" w:afterAutospacing="1"/>
-              <w:rPr>
-                <w:rFonts w:eastAsia="Times New Roman" w:cs="Times New Roman"/>
-                <w:kern w:val="0"/>
-                <w:sz w:val="16"/>
-                <w:szCs w:val="16"/>
-                <w:lang w:val="en-AU" w:eastAsia="en-AU"/>
-                <w14:ligatures w14:val="none"/>
-              </w:rPr>
-            </w:pPr>
-            <w:r>
-              <w:rPr>
-                <w:rFonts w:eastAsia="Times New Roman" w:cs="Times New Roman"/>
-                <w:kern w:val="0"/>
-                <w:sz w:val="16"/>
-                <w:szCs w:val="16"/>
-                <w:lang w:val="en-AU" w:eastAsia="en-AU"/>
-                <w14:ligatures w14:val="none"/>
-              </w:rPr>
-              <w:t xml:space="preserve">Pour the slurry in the bucket slowly onto the sieve to screen out the carbon.</w:t>
-            </w:r>
-          </w:p>
-          <w:p>
-            <w:pPr>
-              <w:pStyle w:val="ListParagraph"/>
-              <w:spacing w:before="100" w:beforeAutospacing="1" w:after="100" w:afterAutospacing="1"/>
-              <w:ind w:left="360"/>
-              <w:rPr>
-                <w:rFonts w:eastAsia="Times New Roman" w:cs="Times New Roman"/>
-                <w:kern w:val="0"/>
-                <w:sz w:val="16"/>
-                <w:szCs w:val="16"/>
-                <w:lang w:val="en-AU" w:eastAsia="en-AU"/>
-                <w14:ligatures w14:val="none"/>
-              </w:rPr>
-            </w:pPr>
-          </w:p>
-          <w:p>
-            <w:pPr>
-              <w:pStyle w:val="ListParagraph"/>
-              <w:numPr>
-                <w:ilvl w:val="0"/>
-                <w:numId w:val="4"/>
-              </w:numPr>
-              <w:spacing w:before="100" w:beforeAutospacing="1" w:after="100" w:afterAutospacing="1"/>
-              <w:rPr>
-                <w:rFonts w:eastAsia="Times New Roman" w:cs="Times New Roman"/>
-                <w:kern w:val="0"/>
-                <w:sz w:val="16"/>
-                <w:szCs w:val="16"/>
-                <w:lang w:val="en-AU" w:eastAsia="en-AU"/>
-                <w14:ligatures w14:val="none"/>
-              </w:rPr>
-            </w:pPr>
-            <w:r>
-              <w:rPr>
-                <w:rFonts w:eastAsia="Times New Roman" w:cs="Times New Roman"/>
-                <w:kern w:val="0"/>
-                <w:sz w:val="16"/>
-                <w:szCs w:val="16"/>
-                <w:lang w:val="en-AU" w:eastAsia="en-AU"/>
-                <w14:ligatures w14:val="none"/>
-              </w:rPr>
-              <w:t xml:space="preserve">Read and record the carbon concentration on the C2 analyser control panel.</w:t>
-            </w:r>
-          </w:p>
-          <w:p>
-            <w:pPr>
-              <w:pStyle w:val="ListParagraph"/>
-              <w:spacing w:before="100" w:beforeAutospacing="1" w:after="100" w:afterAutospacing="1"/>
-              <w:ind w:left="360"/>
-              <w:rPr>
-                <w:rFonts w:eastAsia="Times New Roman" w:cs="Times New Roman"/>
-                <w:kern w:val="0"/>
-                <w:sz w:val="16"/>
-                <w:szCs w:val="16"/>
-                <w:lang w:val="en-AU" w:eastAsia="en-AU"/>
-                <w14:ligatures w14:val="none"/>
-              </w:rPr>
-            </w:pPr>
-          </w:p>
-          <w:p>
-            <w:pPr>
-              <w:pStyle w:val="ListParagraph"/>
-              <w:numPr>
-                <w:ilvl w:val="0"/>
-                <w:numId w:val="4"/>
-              </w:numPr>
-              <w:spacing w:before="100" w:beforeAutospacing="1" w:after="100" w:afterAutospacing="1"/>
-              <w:rPr>
-                <w:rFonts w:eastAsia="Times New Roman" w:cs="Times New Roman"/>
-                <w:kern w:val="0"/>
-                <w:sz w:val="16"/>
-                <w:szCs w:val="16"/>
-                <w:lang w:val="en-AU" w:eastAsia="en-AU"/>
-                <w14:ligatures w14:val="none"/>
-              </w:rPr>
-            </w:pPr>
-            <w:r>
-              <w:rPr>
-                <w:rFonts w:eastAsia="Times New Roman" w:cs="Times New Roman"/>
-                <w:kern w:val="0"/>
-                <w:sz w:val="16"/>
-                <w:szCs w:val="16"/>
-                <w:lang w:val="en-AU" w:eastAsia="en-AU"/>
-                <w14:ligatures w14:val="none"/>
-              </w:rPr>
-              <w:t xml:space="preserve">Wash the slurry off the carbon on the sieve with running water.</w:t>
-            </w:r>
-          </w:p>
-          <w:p>
-            <w:pPr>
-              <w:pStyle w:val="ListParagraph"/>
-              <w:spacing w:before="100" w:beforeAutospacing="1" w:after="100" w:afterAutospacing="1"/>
-              <w:ind w:left="360"/>
-              <w:rPr>
-                <w:rFonts w:eastAsia="Times New Roman" w:cs="Times New Roman"/>
-                <w:kern w:val="0"/>
-                <w:sz w:val="16"/>
-                <w:szCs w:val="16"/>
-                <w:lang w:val="en-AU" w:eastAsia="en-AU"/>
-                <w14:ligatures w14:val="none"/>
-              </w:rPr>
-            </w:pPr>
-          </w:p>
-          <w:p>
-            <w:pPr>
-              <w:pStyle w:val="ListParagraph"/>
-              <w:numPr>
-                <w:ilvl w:val="0"/>
-                <w:numId w:val="4"/>
-              </w:numPr>
-              <w:spacing w:before="100" w:beforeAutospacing="1" w:after="100" w:afterAutospacing="1"/>
-              <w:rPr>
-                <w:rFonts w:eastAsia="Times New Roman" w:cs="Times New Roman"/>
-                <w:kern w:val="0"/>
-                <w:sz w:val="16"/>
-                <w:szCs w:val="16"/>
-                <w:lang w:val="en-AU" w:eastAsia="en-AU"/>
-                <w14:ligatures w14:val="none"/>
-              </w:rPr>
-            </w:pPr>
-            <w:r>
-              <w:rPr>
-                <w:rFonts w:eastAsia="Times New Roman" w:cs="Times New Roman"/>
-                <w:kern w:val="0"/>
-                <w:sz w:val="16"/>
-                <w:szCs w:val="16"/>
-                <w:lang w:val="en-AU" w:eastAsia="en-AU"/>
-                <w14:ligatures w14:val="none"/>
-              </w:rPr>
-              <w:t xml:space="preserve">Funnel the carbon into a 100 mL measuring cylinder. Rinse until no carbon is left on the funnel or sieve.</w:t>
-            </w:r>
-          </w:p>
-          <w:p>
-            <w:pPr>
-              <w:pStyle w:val="ListParagraph"/>
-              <w:spacing w:before="100" w:beforeAutospacing="1" w:after="100" w:afterAutospacing="1"/>
-              <w:ind w:left="360"/>
-              <w:rPr>
-                <w:rFonts w:eastAsia="Times New Roman" w:cs="Times New Roman"/>
-                <w:kern w:val="0"/>
-                <w:sz w:val="16"/>
-                <w:szCs w:val="16"/>
-                <w:lang w:val="en-AU" w:eastAsia="en-AU"/>
-                <w14:ligatures w14:val="none"/>
-              </w:rPr>
-            </w:pPr>
-          </w:p>
-          <w:p>
-            <w:pPr>
-              <w:pStyle w:val="ListParagraph"/>
-              <w:numPr>
-                <w:ilvl w:val="0"/>
-                <w:numId w:val="4"/>
-              </w:numPr>
-              <w:spacing w:before="100" w:beforeAutospacing="1" w:after="100" w:afterAutospacing="1"/>
-              <w:rPr>
-                <w:rFonts w:eastAsia="Times New Roman" w:cs="Times New Roman"/>
-                <w:kern w:val="0"/>
-                <w:sz w:val="16"/>
-                <w:szCs w:val="16"/>
-                <w:lang w:val="en-AU" w:eastAsia="en-AU"/>
-                <w14:ligatures w14:val="none"/>
-              </w:rPr>
-            </w:pPr>
-            <w:r>
-              <w:rPr>
-                <w:rFonts w:eastAsia="Times New Roman" w:cs="Times New Roman"/>
-                <w:kern w:val="0"/>
-                <w:sz w:val="16"/>
-                <w:szCs w:val="16"/>
-                <w:lang w:val="en-AU" w:eastAsia="en-AU"/>
-                <w14:ligatures w14:val="none"/>
-              </w:rPr>
-              <w:t xml:space="preserve">Tap the cylinder to pack the carbon, then record the carbon volume.</w:t>
-            </w:r>
-          </w:p>
-          <w:p>
-            <w:pPr>
-              <w:pStyle w:val="ListParagraph"/>
-              <w:spacing w:before="100" w:beforeAutospacing="1" w:after="100" w:afterAutospacing="1"/>
-              <w:ind w:left="360"/>
-              <w:rPr>
-                <w:rFonts w:eastAsia="Times New Roman" w:cs="Times New Roman"/>
-                <w:kern w:val="0"/>
-                <w:sz w:val="16"/>
-                <w:szCs w:val="16"/>
-                <w:lang w:val="en-AU" w:eastAsia="en-AU"/>
-                <w14:ligatures w14:val="none"/>
-              </w:rPr>
-            </w:pPr>
-          </w:p>
-          <w:p>
-            <w:pPr>
-              <w:pStyle w:val="ListParagraph"/>
-              <w:numPr>
-                <w:ilvl w:val="0"/>
-                <w:numId w:val="4"/>
-              </w:numPr>
-              <w:spacing w:before="100" w:beforeAutospacing="1" w:after="100" w:afterAutospacing="1"/>
-              <w:rPr>
-                <w:rFonts w:eastAsia="Times New Roman" w:cs="Times New Roman"/>
-                <w:kern w:val="0"/>
-                <w:sz w:val="16"/>
-                <w:szCs w:val="16"/>
-                <w:lang w:val="en-AU" w:eastAsia="en-AU"/>
-                <w14:ligatures w14:val="none"/>
-              </w:rPr>
-            </w:pPr>
-            <w:r>
-              <w:rPr>
-                <w:rFonts w:eastAsia="Times New Roman" w:cs="Times New Roman"/>
-                <w:kern w:val="0"/>
-                <w:sz w:val="16"/>
-                <w:szCs w:val="16"/>
-                <w:lang w:val="en-AU" w:eastAsia="en-AU"/>
-                <w14:ligatures w14:val="none"/>
-              </w:rPr>
-              <w:t xml:space="preserve">Carbon concentration (g/L) = carbon volume (mL) / (2 x number of scoops).</w:t>
-            </w:r>
-          </w:p>
-          <w:p>
-            <w:pPr>
-              <w:pStyle w:val="ListParagraph"/>
-              <w:spacing w:before="100" w:beforeAutospacing="1" w:after="100" w:afterAutospacing="1"/>
-              <w:ind w:left="360"/>
-              <w:rPr>
-                <w:rFonts w:eastAsia="Times New Roman" w:cs="Times New Roman"/>
-                <w:kern w:val="0"/>
-                <w:sz w:val="16"/>
-                <w:szCs w:val="16"/>
-                <w:lang w:val="en-AU" w:eastAsia="en-AU"/>
-                <w14:ligatures w14:val="none"/>
-              </w:rPr>
-            </w:pPr>
-          </w:p>
-          <w:p>
-            <w:pPr>
-              <w:pStyle w:val="ListParagraph"/>
-              <w:numPr>
-                <w:ilvl w:val="0"/>
-                <w:numId w:val="4"/>
-              </w:numPr>
-              <w:spacing w:before="100" w:beforeAutospacing="1" w:after="100" w:afterAutospacing="1"/>
-              <w:rPr>
-                <w:rFonts w:eastAsia="Times New Roman" w:cs="Times New Roman"/>
-                <w:kern w:val="0"/>
-                <w:sz w:val="16"/>
-                <w:szCs w:val="16"/>
-                <w:lang w:val="en-AU" w:eastAsia="en-AU"/>
-                <w14:ligatures w14:val="none"/>
-              </w:rPr>
-            </w:pPr>
-            <w:r>
-              <w:rPr>
-                <w:rFonts w:eastAsia="Times New Roman" w:cs="Times New Roman"/>
-                <w:kern w:val="0"/>
-                <w:sz w:val="16"/>
-                <w:szCs w:val="16"/>
-                <w:lang w:val="en-AU" w:eastAsia="en-AU"/>
-                <w14:ligatures w14:val="none"/>
-              </w:rPr>
-              <w:t xml:space="preserve">Compare with the C2 reading. Source tolerance (Martabe tank numbering): 3 g/L for CIL tanks 13 to 7 and 1.5 g/L for CIL tanks 1 and 2. Tolerances for 032-TK-002 to 032-TK-006 are to be set.</w:t>
-            </w:r>
-          </w:p>
-          <w:p>
-            <w:pPr>
-              <w:pStyle w:val="ListParagraph"/>
-              <w:spacing w:before="100" w:beforeAutospacing="1" w:after="100" w:afterAutospacing="1"/>
-              <w:ind w:left="360"/>
-              <w:rPr>
-                <w:rFonts w:eastAsia="Times New Roman" w:cs="Times New Roman"/>
-                <w:kern w:val="0"/>
-                <w:sz w:val="16"/>
-                <w:szCs w:val="16"/>
-                <w:lang w:val="en-AU" w:eastAsia="en-AU"/>
-                <w14:ligatures w14:val="none"/>
-              </w:rPr>
-            </w:pPr>
-          </w:p>
-          <w:p>
-            <w:pPr>
-              <w:pStyle w:val="ListParagraph"/>
-              <w:numPr>
-                <w:ilvl w:val="0"/>
-                <w:numId w:val="4"/>
-              </w:numPr>
-              <w:spacing w:before="100" w:beforeAutospacing="1" w:after="100" w:afterAutospacing="1"/>
-              <w:rPr>
-                <w:rFonts w:eastAsia="Times New Roman" w:cs="Times New Roman"/>
-                <w:kern w:val="0"/>
-                <w:sz w:val="16"/>
-                <w:szCs w:val="16"/>
-                <w:lang w:val="en-AU" w:eastAsia="en-AU"/>
-                <w14:ligatures w14:val="none"/>
-              </w:rPr>
-            </w:pPr>
-            <w:r>
-              <w:rPr>
-                <w:rFonts w:eastAsia="Times New Roman" w:cs="Times New Roman"/>
-                <w:kern w:val="0"/>
-                <w:sz w:val="16"/>
-                <w:szCs w:val="16"/>
-                <w:lang w:val="en-AU" w:eastAsia="en-AU"/>
-                <w14:ligatures w14:val="none"/>
-              </w:rPr>
-              <w:t xml:space="preserve">If the difference is outside tolerance take 3 more samples. If still outside tolerance, adjust the C2 meter and sample again. If still outside, calibrate the C2 meter (Step 5).</w:t>
-            </w:r>
-          </w:p>
-          <w:p>
-            <w:pPr>
-              <w:pStyle w:val="ListParagraph"/>
-              <w:spacing w:before="100" w:beforeAutospacing="1" w:after="100" w:afterAutospacing="1"/>
-              <w:ind w:left="360"/>
-              <w:rPr>
-                <w:rFonts w:eastAsia="Times New Roman" w:cs="Times New Roman"/>
-                <w:kern w:val="0"/>
-                <w:sz w:val="16"/>
-                <w:szCs w:val="16"/>
-                <w:lang w:val="en-AU" w:eastAsia="en-AU"/>
-                <w14:ligatures w14:val="none"/>
-              </w:rPr>
-            </w:pPr>
-          </w:p>
-          <w:p>
-            <w:pPr>
-              <w:pStyle w:val="ListParagraph"/>
-              <w:numPr>
-                <w:ilvl w:val="0"/>
-                <w:numId w:val="4"/>
-              </w:numPr>
-              <w:spacing w:before="100" w:beforeAutospacing="1" w:after="100" w:afterAutospacing="1"/>
-              <w:rPr>
-                <w:rFonts w:eastAsia="Times New Roman" w:cs="Times New Roman"/>
-                <w:kern w:val="0"/>
-                <w:sz w:val="16"/>
-                <w:szCs w:val="16"/>
-                <w:lang w:val="en-AU" w:eastAsia="en-AU"/>
-                <w14:ligatures w14:val="none"/>
-              </w:rPr>
-            </w:pPr>
-            <w:r>
-              <w:rPr>
-                <w:rFonts w:eastAsia="Times New Roman" w:cs="Times New Roman"/>
-                <w:kern w:val="0"/>
-                <w:sz w:val="16"/>
-                <w:szCs w:val="16"/>
-                <w:lang w:val="en-AU" w:eastAsia="en-AU"/>
-                <w14:ligatures w14:val="none"/>
-              </w:rPr>
-              <w:t xml:space="preserve">Put the carbon in a plastic bag and drain the water carried over. Close the bag tightly. Weigh the carbon with the bag for a more accurate result.</w:t>
-            </w:r>
-          </w:p>
-          <w:p>
-            <w:pPr>
-              <w:pStyle w:val="ListParagraph"/>
-              <w:spacing w:before="100" w:beforeAutospacing="1" w:after="100" w:afterAutospacing="1"/>
-              <w:ind w:left="360"/>
-              <w:rPr>
-                <w:rFonts w:eastAsia="Times New Roman" w:cs="Times New Roman"/>
-                <w:kern w:val="0"/>
-                <w:sz w:val="16"/>
-                <w:szCs w:val="16"/>
-                <w:lang w:val="en-AU" w:eastAsia="en-AU"/>
-                <w14:ligatures w14:val="none"/>
-              </w:rPr>
-            </w:pPr>
-          </w:p>
-          <w:p>
-            <w:pPr>
-              <w:pStyle w:val="ListParagraph"/>
-              <w:numPr>
-                <w:ilvl w:val="0"/>
-                <w:numId w:val="4"/>
-              </w:numPr>
-              <w:spacing w:before="100" w:beforeAutospacing="1" w:after="100" w:afterAutospacing="1"/>
-              <w:rPr>
-                <w:rFonts w:eastAsia="Times New Roman" w:cs="Times New Roman"/>
-                <w:kern w:val="0"/>
-                <w:sz w:val="16"/>
-                <w:szCs w:val="16"/>
-                <w:lang w:val="en-AU" w:eastAsia="en-AU"/>
-                <w14:ligatures w14:val="none"/>
-              </w:rPr>
-            </w:pPr>
-            <w:r>
-              <w:rPr>
-                <w:rFonts w:eastAsia="Times New Roman" w:cs="Times New Roman"/>
-                <w:kern w:val="0"/>
-                <w:sz w:val="16"/>
-                <w:szCs w:val="16"/>
-                <w:lang w:val="en-AU" w:eastAsia="en-AU"/>
-                <w14:ligatures w14:val="none"/>
-              </w:rPr>
-              <w:t xml:space="preserve">Record the result in G:\Processing\5. Metallurgy\Metallurgy Lab\04 Metlab Data\Carbon\Carbon Concentration C2.</w:t>
-            </w:r>
-          </w:p>
-          <w:p>
-            <w:pPr>
-              <w:pStyle w:val="ListParagraph"/>
-              <w:spacing w:before="100" w:beforeAutospacing="1" w:after="100" w:afterAutospacing="1"/>
-              <w:ind w:left="360"/>
-              <w:rPr>
-                <w:rFonts w:eastAsia="Times New Roman" w:cs="Times New Roman"/>
-                <w:kern w:val="0"/>
-                <w:sz w:val="16"/>
-                <w:szCs w:val="16"/>
-                <w:lang w:val="en-AU" w:eastAsia="en-AU"/>
-                <w14:ligatures w14:val="none"/>
-              </w:rPr>
-            </w:pPr>
-          </w:p>
-          <w:p>
-            <w:pPr>
-              <w:jc w:val="center"/>
-              <w:rPr>
-                <w:rFonts w:eastAsia="Times New Roman" w:cs="Times New Roman"/>
-                <w:kern w:val="0"/>
-                <w:sz w:val="16"/>
-                <w:szCs w:val="16"/>
-                <w:lang w:val="en-AU" w:eastAsia="en-AU"/>
-                <w14:ligatures w14:val="none"/>
-              </w:rPr>
-            </w:pPr>
-            <w:r>
-              <w:rPr>
-                <w:rFonts w:eastAsia="Times New Roman" w:cs="Times New Roman"/>
-                <w:i/>
-                <w:iCs/>
-                <w:kern w:val="0"/>
-                <w:sz w:val="16"/>
-                <w:szCs w:val="16"/>
-                <w:lang w:val="en-AU" w:eastAsia="en-AU"/>
-                <w14:ligatures w14:val="none"/>
-              </w:rPr>
-              <w:t xml:space="preserve">CAUTION: Close the sampling point cover slowly with hands clear of the pinch point. Watch the position of the bucket sampler. Pour slurry slowly. Keep the solution above pH 10.5. This calculation does not match Step 3 (0.47 g/mL x volume / sample volume); settle one calculation before use.</w:t>
-            </w:r>
-          </w:p>
-          <w:p>
-            <w:pPr>
-              <w:pStyle w:val="ListParagraph"/>
-              <w:rPr>
-                <w:rFonts w:eastAsia="Times New Roman" w:cs="Times New Roman"/>
-                <w:i/>
-                <w:iCs/>
-                <w:kern w:val="0"/>
-                <w:sz w:val="16"/>
-                <w:szCs w:val="16"/>
-                <w:lang w:val="en-AU" w:eastAsia="en-AU"/>
-                <w14:ligatures w14:val="none"/>
-              </w:rPr>
-            </w:pPr>
-          </w:p>
-        </w:tc>
-        <w:tc>
-          <w:tcPr>
-            <w:tcW w:w="4729" w:type="dxa"/>
-            <w:gridSpan w:val="6"/>
-          </w:tcPr>
-          <w:p>
-            <w:pPr>
-              <w:jc w:val="center"/>
-              <w:rPr>
-                <w:sz w:val="20"/>
-                <w:szCs w:val="20"/>
-              </w:rPr>
-            </w:pPr>
-          </w:p>
-        </w:tc>
-      </w:tr>
-      <w:tr>
-        <w:tc>
-          <w:tcPr>
-            <w:tcW w:w="1905" w:type="dxa"/>
-            <w:gridSpan w:val="2"/>
-          </w:tcPr>
-          <w:p>
-            <w:pPr>
-              <w:pStyle w:val="ListParagraph"/>
-              <w:ind w:left="360"/>
-              <w:rPr>
-                <w:b/>
-                <w:bCs/>
-                <w:sz w:val="16"/>
-                <w:szCs w:val="16"/>
-              </w:rPr>
-            </w:pPr>
-          </w:p>
-          <w:p>
-            <w:pPr>
-              <w:pStyle w:val="ListParagraph"/>
-              <w:numPr>
-                <w:ilvl w:val="0"/>
-                <w:numId w:val="5"/>
-              </w:numPr>
-              <w:rPr>
-                <w:b/>
-                <w:bCs/>
-                <w:sz w:val="16"/>
-                <w:szCs w:val="16"/>
-              </w:rPr>
-            </w:pPr>
-            <w:r>
-              <w:rPr>
-                <w:b/>
-                <w:bCs/>
-                <w:sz w:val="16"/>
-                <w:szCs w:val="16"/>
-              </w:rPr>
-              <w:t xml:space="preserve">C2 Meter Calibration</w:t>
-            </w:r>
-          </w:p>
-          <w:p>
-            <w:pPr>
-              <w:rPr>
-                <w:b/>
-                <w:bCs/>
-                <w:sz w:val="16"/>
-                <w:szCs w:val="16"/>
-              </w:rPr>
-            </w:pPr>
-          </w:p>
-          <w:p>
-            <w:pPr>
-              <w:pStyle w:val="ListParagraph"/>
-              <w:numPr>
-                <w:ilvl w:val="0"/>
-                <w:numId w:val="19"/>
-              </w:numPr>
-              <w:rPr>
-                <w:sz w:val="16"/>
-                <w:szCs w:val="16"/>
-                <w:lang w:val="en-AU"/>
-              </w:rPr>
-            </w:pPr>
-            <w:r>
-              <w:rPr>
-                <w:sz w:val="16"/>
-                <w:szCs w:val="16"/>
-              </w:rPr>
-              <w:t xml:space="preserve">Lifting the C2 probe pole</w:t>
-            </w:r>
-          </w:p>
-          <w:p>
-            <w:pPr>
-              <w:pStyle w:val="ListParagraph"/>
-              <w:ind w:left="360"/>
-              <w:rPr>
-                <w:sz w:val="16"/>
-                <w:szCs w:val="16"/>
-                <w:lang w:val="en-AU"/>
-              </w:rPr>
-            </w:pPr>
-          </w:p>
-          <w:p>
-            <w:pPr>
-              <w:pStyle w:val="ListParagraph"/>
-              <w:numPr>
-                <w:ilvl w:val="0"/>
-                <w:numId w:val="19"/>
-              </w:numPr>
-              <w:rPr>
-                <w:sz w:val="16"/>
-                <w:szCs w:val="16"/>
-                <w:lang w:val="en-AU"/>
-              </w:rPr>
-            </w:pPr>
-            <w:r>
-              <w:rPr>
-                <w:sz w:val="16"/>
-                <w:szCs w:val="16"/>
-              </w:rPr>
-              <w:t xml:space="preserve">Moving equipment overhead</w:t>
-            </w:r>
-          </w:p>
-          <w:p>
-            <w:pPr>
-              <w:pStyle w:val="ListParagraph"/>
-              <w:ind w:left="360"/>
-              <w:rPr>
-                <w:sz w:val="16"/>
-                <w:szCs w:val="16"/>
-                <w:lang w:val="en-AU"/>
-              </w:rPr>
-            </w:pPr>
-          </w:p>
-          <w:p>
-            <w:pPr>
-              <w:pStyle w:val="ListParagraph"/>
-              <w:numPr>
-                <w:ilvl w:val="0"/>
-                <w:numId w:val="19"/>
-              </w:numPr>
-              <w:rPr>
-                <w:sz w:val="16"/>
-                <w:szCs w:val="16"/>
-                <w:lang w:val="en-AU"/>
-              </w:rPr>
-            </w:pPr>
-            <w:r>
-              <w:rPr>
-                <w:sz w:val="16"/>
-                <w:szCs w:val="16"/>
-              </w:rPr>
-              <w:t xml:space="preserve">Slurry splash at the C2 probe</w:t>
-            </w:r>
-          </w:p>
-          <w:p>
-            <w:pPr>
-              <w:pStyle w:val="ListParagraph"/>
-              <w:ind w:left="360"/>
-              <w:rPr>
-                <w:sz w:val="16"/>
-                <w:szCs w:val="16"/>
-                <w:lang w:val="en-AU"/>
-              </w:rPr>
-            </w:pPr>
-          </w:p>
-          <w:p>
-            <w:pPr>
-              <w:pStyle w:val="ListParagraph"/>
-              <w:numPr>
-                <w:ilvl w:val="0"/>
-                <w:numId w:val="19"/>
-              </w:numPr>
-              <w:rPr>
-                <w:sz w:val="16"/>
-                <w:szCs w:val="16"/>
-                <w:lang w:val="en-AU"/>
-              </w:rPr>
-            </w:pPr>
-            <w:r>
-              <w:rPr>
-                <w:sz w:val="16"/>
-                <w:szCs w:val="16"/>
-              </w:rPr>
-              <w:t xml:space="preserve">HCN alarm active near the work area</w:t>
-            </w:r>
-          </w:p>
-        </w:tc>
-        <w:tc>
-          <w:tcPr>
-            <w:tcW w:w="3998" w:type="dxa"/>
-            <w:gridSpan w:val="7"/>
-          </w:tcPr>
-          <w:p>
-            <w:pPr>
-              <w:pStyle w:val="ListParagraph"/>
-              <w:spacing w:before="100" w:beforeAutospacing="1" w:after="100" w:afterAutospacing="1"/>
-              <w:ind w:left="360"/>
-              <w:rPr>
-                <w:rFonts w:eastAsia="Times New Roman" w:cs="Times New Roman"/>
-                <w:kern w:val="0"/>
-                <w:sz w:val="16"/>
-                <w:szCs w:val="16"/>
-                <w:lang w:val="en-AU" w:eastAsia="en-AU"/>
-                <w14:ligatures w14:val="none"/>
-              </w:rPr>
-            </w:pPr>
-          </w:p>
-          <w:p>
-            <w:pPr>
-              <w:pStyle w:val="ListParagraph"/>
-              <w:numPr>
-                <w:ilvl w:val="0"/>
-                <w:numId w:val="4"/>
-              </w:numPr>
-              <w:spacing w:before="100" w:beforeAutospacing="1" w:after="100" w:afterAutospacing="1"/>
-              <w:rPr>
-                <w:rFonts w:eastAsia="Times New Roman" w:cs="Times New Roman"/>
-                <w:kern w:val="0"/>
-                <w:sz w:val="16"/>
-                <w:szCs w:val="16"/>
-                <w:lang w:val="en-AU" w:eastAsia="en-AU"/>
-                <w14:ligatures w14:val="none"/>
-              </w:rPr>
-            </w:pPr>
-            <w:r>
-              <w:rPr>
-                <w:rFonts w:eastAsia="Times New Roman" w:cs="Times New Roman"/>
-                <w:kern w:val="0"/>
-                <w:sz w:val="16"/>
-                <w:szCs w:val="16"/>
-                <w:lang w:val="en-AU" w:eastAsia="en-AU"/>
-                <w14:ligatures w14:val="none"/>
-              </w:rPr>
-              <w:t xml:space="preserve">Prepare the sampler, 100 mL measuring cylinder, funnel, C2 carbon sieve basket, 20 L bucket, C2 meter, sieve, screwdriver and Marcy scale. Have process water and CIL slurry containing carbon ready. Take 5 first.</w:t>
-            </w:r>
-          </w:p>
-          <w:p>
-            <w:pPr>
-              <w:pStyle w:val="ListParagraph"/>
-              <w:spacing w:before="100" w:beforeAutospacing="1" w:after="100" w:afterAutospacing="1"/>
-              <w:ind w:left="360"/>
-              <w:rPr>
-                <w:rFonts w:eastAsia="Times New Roman" w:cs="Times New Roman"/>
-                <w:kern w:val="0"/>
-                <w:sz w:val="16"/>
-                <w:szCs w:val="16"/>
-                <w:lang w:val="en-AU" w:eastAsia="en-AU"/>
-                <w14:ligatures w14:val="none"/>
-              </w:rPr>
-            </w:pPr>
-          </w:p>
-          <w:p>
-            <w:pPr>
-              <w:pStyle w:val="ListParagraph"/>
-              <w:numPr>
-                <w:ilvl w:val="0"/>
-                <w:numId w:val="4"/>
-              </w:numPr>
-              <w:spacing w:before="100" w:beforeAutospacing="1" w:after="100" w:afterAutospacing="1"/>
-              <w:rPr>
-                <w:rFonts w:eastAsia="Times New Roman" w:cs="Times New Roman"/>
-                <w:kern w:val="0"/>
-                <w:sz w:val="16"/>
-                <w:szCs w:val="16"/>
-                <w:lang w:val="en-AU" w:eastAsia="en-AU"/>
-                <w14:ligatures w14:val="none"/>
-              </w:rPr>
-            </w:pPr>
-            <w:r>
-              <w:rPr>
-                <w:rFonts w:eastAsia="Times New Roman" w:cs="Times New Roman"/>
-                <w:kern w:val="0"/>
-                <w:sz w:val="16"/>
-                <w:szCs w:val="16"/>
-                <w:lang w:val="en-AU" w:eastAsia="en-AU"/>
-                <w14:ligatures w14:val="none"/>
-              </w:rPr>
-              <w:t xml:space="preserve">Find the nearest safety shower and check it works. Ask the operator to stop the carbon transfer pump on the tank being checked.</w:t>
-            </w:r>
-          </w:p>
-          <w:p>
-            <w:pPr>
-              <w:pStyle w:val="ListParagraph"/>
-              <w:spacing w:before="100" w:beforeAutospacing="1" w:after="100" w:afterAutospacing="1"/>
-              <w:ind w:left="360"/>
-              <w:rPr>
-                <w:rFonts w:eastAsia="Times New Roman" w:cs="Times New Roman"/>
-                <w:kern w:val="0"/>
-                <w:sz w:val="16"/>
-                <w:szCs w:val="16"/>
-                <w:lang w:val="en-AU" w:eastAsia="en-AU"/>
-                <w14:ligatures w14:val="none"/>
-              </w:rPr>
-            </w:pPr>
-          </w:p>
-          <w:p>
-            <w:pPr>
-              <w:pStyle w:val="ListParagraph"/>
-              <w:numPr>
-                <w:ilvl w:val="0"/>
-                <w:numId w:val="4"/>
-              </w:numPr>
-              <w:spacing w:before="100" w:beforeAutospacing="1" w:after="100" w:afterAutospacing="1"/>
-              <w:rPr>
-                <w:rFonts w:eastAsia="Times New Roman" w:cs="Times New Roman"/>
-                <w:kern w:val="0"/>
-                <w:sz w:val="16"/>
-                <w:szCs w:val="16"/>
-                <w:lang w:val="en-AU" w:eastAsia="en-AU"/>
-                <w14:ligatures w14:val="none"/>
-              </w:rPr>
-            </w:pPr>
-            <w:r>
-              <w:rPr>
-                <w:rFonts w:eastAsia="Times New Roman" w:cs="Times New Roman"/>
-                <w:kern w:val="0"/>
-                <w:sz w:val="16"/>
-                <w:szCs w:val="16"/>
-                <w:lang w:val="en-AU" w:eastAsia="en-AU"/>
-                <w14:ligatures w14:val="none"/>
-              </w:rPr>
-              <w:t xml:space="preserve">Make sure no HCN gas detector alarm is active near the work area (alarm 5 ppm).</w:t>
-            </w:r>
-          </w:p>
-          <w:p>
-            <w:pPr>
-              <w:pStyle w:val="ListParagraph"/>
-              <w:spacing w:before="100" w:beforeAutospacing="1" w:after="100" w:afterAutospacing="1"/>
-              <w:ind w:left="360"/>
-              <w:rPr>
-                <w:rFonts w:eastAsia="Times New Roman" w:cs="Times New Roman"/>
-                <w:kern w:val="0"/>
-                <w:sz w:val="16"/>
-                <w:szCs w:val="16"/>
-                <w:lang w:val="en-AU" w:eastAsia="en-AU"/>
-                <w14:ligatures w14:val="none"/>
-              </w:rPr>
-            </w:pPr>
-          </w:p>
-          <w:p>
-            <w:pPr>
-              <w:pStyle w:val="ListParagraph"/>
-              <w:numPr>
-                <w:ilvl w:val="0"/>
-                <w:numId w:val="4"/>
-              </w:numPr>
-              <w:spacing w:before="100" w:beforeAutospacing="1" w:after="100" w:afterAutospacing="1"/>
-              <w:rPr>
-                <w:rFonts w:eastAsia="Times New Roman" w:cs="Times New Roman"/>
-                <w:kern w:val="0"/>
-                <w:sz w:val="16"/>
-                <w:szCs w:val="16"/>
-                <w:lang w:val="en-AU" w:eastAsia="en-AU"/>
-                <w14:ligatures w14:val="none"/>
-              </w:rPr>
-            </w:pPr>
-            <w:r>
-              <w:rPr>
-                <w:rFonts w:eastAsia="Times New Roman" w:cs="Times New Roman"/>
-                <w:kern w:val="0"/>
-                <w:sz w:val="16"/>
-                <w:szCs w:val="16"/>
-                <w:lang w:val="en-AU" w:eastAsia="en-AU"/>
-                <w14:ligatures w14:val="none"/>
-              </w:rPr>
-              <w:t xml:space="preserve">Lift the C2 probe out of the tank. Two people must do the lift. Check the probe and clean off anything caught in it.</w:t>
-            </w:r>
-          </w:p>
-          <w:p>
-            <w:pPr>
-              <w:pStyle w:val="ListParagraph"/>
-              <w:spacing w:before="100" w:beforeAutospacing="1" w:after="100" w:afterAutospacing="1"/>
-              <w:ind w:left="360"/>
-              <w:rPr>
-                <w:rFonts w:eastAsia="Times New Roman" w:cs="Times New Roman"/>
-                <w:kern w:val="0"/>
-                <w:sz w:val="16"/>
-                <w:szCs w:val="16"/>
-                <w:lang w:val="en-AU" w:eastAsia="en-AU"/>
-                <w14:ligatures w14:val="none"/>
-              </w:rPr>
-            </w:pPr>
-          </w:p>
-          <w:p>
-            <w:pPr>
-              <w:pStyle w:val="ListParagraph"/>
-              <w:numPr>
-                <w:ilvl w:val="0"/>
-                <w:numId w:val="4"/>
-              </w:numPr>
-              <w:spacing w:before="100" w:beforeAutospacing="1" w:after="100" w:afterAutospacing="1"/>
-              <w:rPr>
-                <w:rFonts w:eastAsia="Times New Roman" w:cs="Times New Roman"/>
-                <w:kern w:val="0"/>
-                <w:sz w:val="16"/>
-                <w:szCs w:val="16"/>
-                <w:lang w:val="en-AU" w:eastAsia="en-AU"/>
-                <w14:ligatures w14:val="none"/>
-              </w:rPr>
-            </w:pPr>
-            <w:r>
-              <w:rPr>
-                <w:rFonts w:eastAsia="Times New Roman" w:cs="Times New Roman"/>
-                <w:kern w:val="0"/>
-                <w:sz w:val="16"/>
-                <w:szCs w:val="16"/>
-                <w:lang w:val="en-AU" w:eastAsia="en-AU"/>
-                <w14:ligatures w14:val="none"/>
-              </w:rPr>
-              <w:t xml:space="preserve">On the panel main screen press F4 (settings), move to calibration with F1 or F2 and select it with F3. Press F1 to open the calibration screen.</w:t>
-            </w:r>
-          </w:p>
-          <w:p>
-            <w:pPr>
-              <w:pStyle w:val="ListParagraph"/>
-              <w:spacing w:before="100" w:beforeAutospacing="1" w:after="100" w:afterAutospacing="1"/>
-              <w:ind w:left="360"/>
-              <w:rPr>
-                <w:rFonts w:eastAsia="Times New Roman" w:cs="Times New Roman"/>
-                <w:kern w:val="0"/>
-                <w:sz w:val="16"/>
-                <w:szCs w:val="16"/>
-                <w:lang w:val="en-AU" w:eastAsia="en-AU"/>
-                <w14:ligatures w14:val="none"/>
-              </w:rPr>
-            </w:pPr>
-          </w:p>
-          <w:p>
-            <w:pPr>
-              <w:pStyle w:val="ListParagraph"/>
-              <w:numPr>
-                <w:ilvl w:val="0"/>
-                <w:numId w:val="4"/>
-              </w:numPr>
-              <w:spacing w:before="100" w:beforeAutospacing="1" w:after="100" w:afterAutospacing="1"/>
-              <w:rPr>
-                <w:rFonts w:eastAsia="Times New Roman" w:cs="Times New Roman"/>
-                <w:kern w:val="0"/>
-                <w:sz w:val="16"/>
-                <w:szCs w:val="16"/>
-                <w:lang w:val="en-AU" w:eastAsia="en-AU"/>
-                <w14:ligatures w14:val="none"/>
-              </w:rPr>
-            </w:pPr>
-            <w:r>
-              <w:rPr>
-                <w:rFonts w:eastAsia="Times New Roman" w:cs="Times New Roman"/>
-                <w:kern w:val="0"/>
-                <w:sz w:val="16"/>
-                <w:szCs w:val="16"/>
-                <w:lang w:val="en-AU" w:eastAsia="en-AU"/>
-                <w14:ligatures w14:val="none"/>
-              </w:rPr>
-              <w:t xml:space="preserve">Tick Bypass Water Calibration only if the probe is thought to be damaged or it is a new probe: attenuation in water seldom changes between calibrations.</w:t>
-            </w:r>
-          </w:p>
-          <w:p>
-            <w:pPr>
-              <w:pStyle w:val="ListParagraph"/>
-              <w:spacing w:before="100" w:beforeAutospacing="1" w:after="100" w:afterAutospacing="1"/>
-              <w:ind w:left="360"/>
-              <w:rPr>
-                <w:rFonts w:eastAsia="Times New Roman" w:cs="Times New Roman"/>
-                <w:kern w:val="0"/>
-                <w:sz w:val="16"/>
-                <w:szCs w:val="16"/>
-                <w:lang w:val="en-AU" w:eastAsia="en-AU"/>
-                <w14:ligatures w14:val="none"/>
-              </w:rPr>
-            </w:pPr>
-          </w:p>
-          <w:p>
-            <w:pPr>
-              <w:pStyle w:val="ListParagraph"/>
-              <w:numPr>
-                <w:ilvl w:val="0"/>
-                <w:numId w:val="4"/>
-              </w:numPr>
-              <w:spacing w:before="100" w:beforeAutospacing="1" w:after="100" w:afterAutospacing="1"/>
-              <w:rPr>
-                <w:rFonts w:eastAsia="Times New Roman" w:cs="Times New Roman"/>
-                <w:kern w:val="0"/>
-                <w:sz w:val="16"/>
-                <w:szCs w:val="16"/>
-                <w:lang w:val="en-AU" w:eastAsia="en-AU"/>
-                <w14:ligatures w14:val="none"/>
-              </w:rPr>
-            </w:pPr>
-            <w:r>
-              <w:rPr>
-                <w:rFonts w:eastAsia="Times New Roman" w:cs="Times New Roman"/>
-                <w:kern w:val="0"/>
-                <w:sz w:val="16"/>
-                <w:szCs w:val="16"/>
-                <w:lang w:val="en-AU" w:eastAsia="en-AU"/>
-                <w14:ligatures w14:val="none"/>
-              </w:rPr>
-              <w:t xml:space="preserve">Take 3 slurry samples near the probe. Find the carbon concentration (g/L) by the manual method in Step 4, and the slurry density with the Marcy scale.</w:t>
-            </w:r>
-          </w:p>
-          <w:p>
-            <w:pPr>
-              <w:pStyle w:val="ListParagraph"/>
-              <w:spacing w:before="100" w:beforeAutospacing="1" w:after="100" w:afterAutospacing="1"/>
-              <w:ind w:left="360"/>
-              <w:rPr>
-                <w:rFonts w:eastAsia="Times New Roman" w:cs="Times New Roman"/>
-                <w:kern w:val="0"/>
-                <w:sz w:val="16"/>
-                <w:szCs w:val="16"/>
-                <w:lang w:val="en-AU" w:eastAsia="en-AU"/>
-                <w14:ligatures w14:val="none"/>
-              </w:rPr>
-            </w:pPr>
-          </w:p>
-          <w:p>
-            <w:pPr>
-              <w:pStyle w:val="ListParagraph"/>
-              <w:numPr>
-                <w:ilvl w:val="0"/>
-                <w:numId w:val="4"/>
-              </w:numPr>
-              <w:spacing w:before="100" w:beforeAutospacing="1" w:after="100" w:afterAutospacing="1"/>
-              <w:rPr>
-                <w:rFonts w:eastAsia="Times New Roman" w:cs="Times New Roman"/>
-                <w:kern w:val="0"/>
-                <w:sz w:val="16"/>
-                <w:szCs w:val="16"/>
-                <w:lang w:val="en-AU" w:eastAsia="en-AU"/>
-                <w14:ligatures w14:val="none"/>
-              </w:rPr>
-            </w:pPr>
-            <w:r>
-              <w:rPr>
-                <w:rFonts w:eastAsia="Times New Roman" w:cs="Times New Roman"/>
-                <w:kern w:val="0"/>
-                <w:sz w:val="16"/>
-                <w:szCs w:val="16"/>
-                <w:lang w:val="en-AU" w:eastAsia="en-AU"/>
-                <w14:ligatures w14:val="none"/>
-              </w:rPr>
-              <w:t xml:space="preserve">Water sensitivity (when not bypassing): put the probe in the 20 L bucket of process water and press F1. The meter finds the attenuation in water (dB).</w:t>
-            </w:r>
-          </w:p>
-          <w:p>
-            <w:pPr>
-              <w:pStyle w:val="ListParagraph"/>
-              <w:spacing w:before="100" w:beforeAutospacing="1" w:after="100" w:afterAutospacing="1"/>
-              <w:ind w:left="360"/>
-              <w:rPr>
-                <w:rFonts w:eastAsia="Times New Roman" w:cs="Times New Roman"/>
-                <w:kern w:val="0"/>
-                <w:sz w:val="16"/>
-                <w:szCs w:val="16"/>
-                <w:lang w:val="en-AU" w:eastAsia="en-AU"/>
-                <w14:ligatures w14:val="none"/>
-              </w:rPr>
-            </w:pPr>
-          </w:p>
-          <w:p>
-            <w:pPr>
-              <w:pStyle w:val="ListParagraph"/>
-              <w:numPr>
-                <w:ilvl w:val="0"/>
-                <w:numId w:val="4"/>
-              </w:numPr>
-              <w:spacing w:before="100" w:beforeAutospacing="1" w:after="100" w:afterAutospacing="1"/>
-              <w:rPr>
-                <w:rFonts w:eastAsia="Times New Roman" w:cs="Times New Roman"/>
-                <w:kern w:val="0"/>
-                <w:sz w:val="16"/>
-                <w:szCs w:val="16"/>
-                <w:lang w:val="en-AU" w:eastAsia="en-AU"/>
-                <w14:ligatures w14:val="none"/>
-              </w:rPr>
-            </w:pPr>
-            <w:r>
-              <w:rPr>
-                <w:rFonts w:eastAsia="Times New Roman" w:cs="Times New Roman"/>
-                <w:kern w:val="0"/>
-                <w:sz w:val="16"/>
-                <w:szCs w:val="16"/>
-                <w:lang w:val="en-AU" w:eastAsia="en-AU"/>
-                <w14:ligatures w14:val="none"/>
-              </w:rPr>
-              <w:t xml:space="preserve">Slurry density sensitivity: take the probe out of the bucket and put it in the carbon sieve basket, with the seal fitted. Put the probe back in the tank and press F1. The meter finds the attenuation due to the slurry. Enter the relative density (RD) you measured.</w:t>
-            </w:r>
-          </w:p>
-          <w:p>
-            <w:pPr>
-              <w:pStyle w:val="ListParagraph"/>
-              <w:spacing w:before="100" w:beforeAutospacing="1" w:after="100" w:afterAutospacing="1"/>
-              <w:ind w:left="360"/>
-              <w:rPr>
-                <w:rFonts w:eastAsia="Times New Roman" w:cs="Times New Roman"/>
-                <w:kern w:val="0"/>
-                <w:sz w:val="16"/>
-                <w:szCs w:val="16"/>
-                <w:lang w:val="en-AU" w:eastAsia="en-AU"/>
-                <w14:ligatures w14:val="none"/>
-              </w:rPr>
-            </w:pPr>
-          </w:p>
-          <w:p>
-            <w:pPr>
-              <w:pStyle w:val="ListParagraph"/>
-              <w:numPr>
-                <w:ilvl w:val="0"/>
-                <w:numId w:val="4"/>
-              </w:numPr>
-              <w:spacing w:before="100" w:beforeAutospacing="1" w:after="100" w:afterAutospacing="1"/>
-              <w:rPr>
-                <w:rFonts w:eastAsia="Times New Roman" w:cs="Times New Roman"/>
-                <w:kern w:val="0"/>
-                <w:sz w:val="16"/>
-                <w:szCs w:val="16"/>
-                <w:lang w:val="en-AU" w:eastAsia="en-AU"/>
-                <w14:ligatures w14:val="none"/>
-              </w:rPr>
-            </w:pPr>
-            <w:r>
-              <w:rPr>
-                <w:rFonts w:eastAsia="Times New Roman" w:cs="Times New Roman"/>
-                <w:kern w:val="0"/>
-                <w:sz w:val="16"/>
-                <w:szCs w:val="16"/>
-                <w:lang w:val="en-AU" w:eastAsia="en-AU"/>
-                <w14:ligatures w14:val="none"/>
-              </w:rPr>
-              <w:t xml:space="preserve">Carbon sensitivity: take the probe out, wash off the slurry with water, drain it by hanging it briefly on the handrail, and take it out of the basket. Put it back in the tank and press F1. The meter finds the attenuation due to slurry and carbon. Enter the average carbon concentration (CC) you measured.</w:t>
-            </w:r>
-          </w:p>
-          <w:p>
-            <w:pPr>
-              <w:pStyle w:val="ListParagraph"/>
-              <w:spacing w:before="100" w:beforeAutospacing="1" w:after="100" w:afterAutospacing="1"/>
-              <w:ind w:left="360"/>
-              <w:rPr>
-                <w:rFonts w:eastAsia="Times New Roman" w:cs="Times New Roman"/>
-                <w:kern w:val="0"/>
-                <w:sz w:val="16"/>
-                <w:szCs w:val="16"/>
-                <w:lang w:val="en-AU" w:eastAsia="en-AU"/>
-                <w14:ligatures w14:val="none"/>
-              </w:rPr>
-            </w:pPr>
-          </w:p>
-          <w:p>
-            <w:pPr>
-              <w:pStyle w:val="ListParagraph"/>
-              <w:numPr>
-                <w:ilvl w:val="0"/>
-                <w:numId w:val="4"/>
-              </w:numPr>
-              <w:spacing w:before="100" w:beforeAutospacing="1" w:after="100" w:afterAutospacing="1"/>
-              <w:rPr>
-                <w:rFonts w:eastAsia="Times New Roman" w:cs="Times New Roman"/>
-                <w:kern w:val="0"/>
-                <w:sz w:val="16"/>
-                <w:szCs w:val="16"/>
-                <w:lang w:val="en-AU" w:eastAsia="en-AU"/>
-                <w14:ligatures w14:val="none"/>
-              </w:rPr>
-            </w:pPr>
-            <w:r>
-              <w:rPr>
-                <w:rFonts w:eastAsia="Times New Roman" w:cs="Times New Roman"/>
-                <w:kern w:val="0"/>
-                <w:sz w:val="16"/>
-                <w:szCs w:val="16"/>
-                <w:lang w:val="en-AU" w:eastAsia="en-AU"/>
-                <w14:ligatures w14:val="none"/>
-              </w:rPr>
-              <w:t xml:space="preserve">The meter generates a new set of constants. Press F1 to accept them or F4 to reject them. Expected values in the source: water attenuation (ATTO) 9 to 15 dB, Mrd 20 to 50, Mcc 0.3 to 0.8.</w:t>
-            </w:r>
-          </w:p>
-          <w:p>
-            <w:pPr>
-              <w:pStyle w:val="ListParagraph"/>
-              <w:spacing w:before="100" w:beforeAutospacing="1" w:after="100" w:afterAutospacing="1"/>
-              <w:ind w:left="360"/>
-              <w:rPr>
-                <w:rFonts w:eastAsia="Times New Roman" w:cs="Times New Roman"/>
-                <w:kern w:val="0"/>
-                <w:sz w:val="16"/>
-                <w:szCs w:val="16"/>
-                <w:lang w:val="en-AU" w:eastAsia="en-AU"/>
-                <w14:ligatures w14:val="none"/>
-              </w:rPr>
-            </w:pPr>
-          </w:p>
-          <w:p>
-            <w:pPr>
-              <w:pStyle w:val="ListParagraph"/>
-              <w:numPr>
-                <w:ilvl w:val="0"/>
-                <w:numId w:val="4"/>
-              </w:numPr>
-              <w:spacing w:before="100" w:beforeAutospacing="1" w:after="100" w:afterAutospacing="1"/>
-              <w:rPr>
-                <w:rFonts w:eastAsia="Times New Roman" w:cs="Times New Roman"/>
-                <w:kern w:val="0"/>
-                <w:sz w:val="16"/>
-                <w:szCs w:val="16"/>
-                <w:lang w:val="en-AU" w:eastAsia="en-AU"/>
-                <w14:ligatures w14:val="none"/>
-              </w:rPr>
-            </w:pPr>
-            <w:r>
-              <w:rPr>
-                <w:rFonts w:eastAsia="Times New Roman" w:cs="Times New Roman"/>
-                <w:kern w:val="0"/>
-                <w:sz w:val="16"/>
-                <w:szCs w:val="16"/>
-                <w:lang w:val="en-AU" w:eastAsia="en-AU"/>
-                <w14:ligatures w14:val="none"/>
-              </w:rPr>
-              <w:t xml:space="preserve">If rejected, the previous constants stay and the new ones are lost. If accepted, the new constants replace the old ones, which are kept on the calibration screen for reference.</w:t>
-            </w:r>
-          </w:p>
-          <w:p>
-            <w:pPr>
-              <w:pStyle w:val="ListParagraph"/>
-              <w:spacing w:before="100" w:beforeAutospacing="1" w:after="100" w:afterAutospacing="1"/>
-              <w:ind w:left="360"/>
-              <w:rPr>
-                <w:rFonts w:eastAsia="Times New Roman" w:cs="Times New Roman"/>
-                <w:kern w:val="0"/>
-                <w:sz w:val="16"/>
-                <w:szCs w:val="16"/>
-                <w:lang w:val="en-AU" w:eastAsia="en-AU"/>
-                <w14:ligatures w14:val="none"/>
-              </w:rPr>
-            </w:pPr>
-          </w:p>
-          <w:p>
-            <w:pPr>
-              <w:pStyle w:val="ListParagraph"/>
-              <w:numPr>
-                <w:ilvl w:val="0"/>
-                <w:numId w:val="4"/>
-              </w:numPr>
-              <w:spacing w:before="100" w:beforeAutospacing="1" w:after="100" w:afterAutospacing="1"/>
-              <w:rPr>
-                <w:rFonts w:eastAsia="Times New Roman" w:cs="Times New Roman"/>
-                <w:kern w:val="0"/>
-                <w:sz w:val="16"/>
-                <w:szCs w:val="16"/>
-                <w:lang w:val="en-AU" w:eastAsia="en-AU"/>
-                <w14:ligatures w14:val="none"/>
-              </w:rPr>
-            </w:pPr>
-            <w:r>
-              <w:rPr>
-                <w:rFonts w:eastAsia="Times New Roman" w:cs="Times New Roman"/>
-                <w:kern w:val="0"/>
-                <w:sz w:val="16"/>
-                <w:szCs w:val="16"/>
-                <w:lang w:val="en-AU" w:eastAsia="en-AU"/>
-                <w14:ligatures w14:val="none"/>
-              </w:rPr>
-              <w:t xml:space="preserve">Record the C2 readings before and after calibration in G:\Processing\5. Metallurgy\Metallurgy Lab\04 Metlab Data\Calibration Logsheet\Logsheet C2 Meter Calibration or on form DOC-4-MET-PMC-DFR-00132-EN (Form C2 Meter Calibration.xlsx).</w:t>
-            </w:r>
-          </w:p>
-          <w:p>
-            <w:pPr>
-              <w:pStyle w:val="ListParagraph"/>
-              <w:spacing w:before="100" w:beforeAutospacing="1" w:after="100" w:afterAutospacing="1"/>
-              <w:ind w:left="360"/>
-              <w:rPr>
-                <w:rFonts w:eastAsia="Times New Roman" w:cs="Times New Roman"/>
-                <w:kern w:val="0"/>
-                <w:sz w:val="16"/>
-                <w:szCs w:val="16"/>
-                <w:lang w:val="en-AU" w:eastAsia="en-AU"/>
-                <w14:ligatures w14:val="none"/>
-              </w:rPr>
-            </w:pPr>
-          </w:p>
-          <w:p>
-            <w:pPr>
-              <w:jc w:val="center"/>
-              <w:rPr>
-                <w:rFonts w:eastAsia="Times New Roman" w:cs="Times New Roman"/>
-                <w:kern w:val="0"/>
-                <w:sz w:val="16"/>
-                <w:szCs w:val="16"/>
-                <w:lang w:val="en-AU" w:eastAsia="en-AU"/>
-                <w14:ligatures w14:val="none"/>
-              </w:rPr>
-            </w:pPr>
-            <w:r>
-              <w:rPr>
-                <w:rFonts w:eastAsia="Times New Roman" w:cs="Times New Roman"/>
-                <w:i/>
-                <w:iCs/>
-                <w:kern w:val="0"/>
-                <w:sz w:val="16"/>
-                <w:szCs w:val="16"/>
-                <w:lang w:val="en-AU" w:eastAsia="en-AU"/>
-                <w14:ligatures w14:val="none"/>
-              </w:rPr>
-              <w:t xml:space="preserve">CAUTION: Two people lift the C2 probe pole and nothing may be moving overhead. Keep hands clear of pinch points, use correct manual handling and careful footing on wet floors. All HCN controls and PPE for this SWI apply.</w:t>
-            </w:r>
-          </w:p>
-          <w:p>
-            <w:pPr>
-              <w:pStyle w:val="ListParagraph"/>
-              <w:rPr>
-                <w:rFonts w:eastAsia="Times New Roman" w:cs="Times New Roman"/>
-                <w:i/>
-                <w:iCs/>
-                <w:kern w:val="0"/>
-                <w:sz w:val="16"/>
-                <w:szCs w:val="16"/>
-                <w:lang w:val="en-AU" w:eastAsia="en-AU"/>
-                <w14:ligatures w14:val="none"/>
-              </w:rPr>
-            </w:pPr>
-          </w:p>
-        </w:tc>
-        <w:tc>
-          <w:tcPr>
-            <w:tcW w:w="4729" w:type="dxa"/>
-            <w:gridSpan w:val="6"/>
-          </w:tcPr>
-          <w:p>
-            <w:pPr>
-              <w:jc w:val="center"/>
-              <w:rPr>
-                <w:sz w:val="20"/>
-                <w:szCs w:val="20"/>
-              </w:rPr>
-            </w:pPr>
-          </w:p>
-        </w:tc>
-      </w:tr>
-      <w:tr>
-        <w:tc>
-          <w:tcPr>
-            <w:tcW w:w="1905" w:type="dxa"/>
-            <w:gridSpan w:val="2"/>
-          </w:tcPr>
-          <w:p>
-            <w:pPr>
-              <w:pStyle w:val="ListParagraph"/>
-              <w:ind w:left="360"/>
-              <w:rPr>
-                <w:b/>
-                <w:bCs/>
-                <w:sz w:val="16"/>
-                <w:szCs w:val="16"/>
-              </w:rPr>
-            </w:pPr>
-          </w:p>
-          <w:p>
-            <w:pPr>
-              <w:pStyle w:val="ListParagraph"/>
-              <w:numPr>
-                <w:ilvl w:val="0"/>
-                <w:numId w:val="5"/>
-              </w:numPr>
-              <w:rPr>
-                <w:b/>
-                <w:bCs/>
-                <w:sz w:val="16"/>
-                <w:szCs w:val="16"/>
-              </w:rPr>
-            </w:pPr>
-            <w:r>
-              <w:rPr>
-                <w:b/>
-                <w:bCs/>
-                <w:sz w:val="16"/>
-                <w:szCs w:val="16"/>
-              </w:rPr>
-              <w:t xml:space="preserve">Completion and Clean Up</w:t>
-            </w:r>
-          </w:p>
-          <w:p>
-            <w:pPr>
-              <w:rPr>
-                <w:b/>
-                <w:bCs/>
-                <w:sz w:val="16"/>
-                <w:szCs w:val="16"/>
-              </w:rPr>
-            </w:pPr>
-          </w:p>
-          <w:p>
-            <w:pPr>
-              <w:pStyle w:val="ListParagraph"/>
-              <w:numPr>
-                <w:ilvl w:val="0"/>
-                <w:numId w:val="20"/>
-              </w:numPr>
-              <w:rPr>
-                <w:sz w:val="16"/>
-                <w:szCs w:val="16"/>
-                <w:lang w:val="en-AU"/>
-              </w:rPr>
-            </w:pPr>
-            <w:r>
-              <w:rPr>
-                <w:sz w:val="16"/>
-                <w:szCs w:val="16"/>
-              </w:rPr>
-              <w:t xml:space="preserve">Sample valve left weeping</w:t>
-            </w:r>
-          </w:p>
-          <w:p>
-            <w:pPr>
-              <w:pStyle w:val="ListParagraph"/>
-              <w:ind w:left="360"/>
-              <w:rPr>
-                <w:sz w:val="16"/>
-                <w:szCs w:val="16"/>
-                <w:lang w:val="en-AU"/>
-              </w:rPr>
-            </w:pPr>
-          </w:p>
-          <w:p>
-            <w:pPr>
-              <w:pStyle w:val="ListParagraph"/>
-              <w:numPr>
-                <w:ilvl w:val="0"/>
-                <w:numId w:val="20"/>
-              </w:numPr>
-              <w:rPr>
-                <w:sz w:val="16"/>
-                <w:szCs w:val="16"/>
-                <w:lang w:val="en-AU"/>
-              </w:rPr>
-            </w:pPr>
-            <w:r>
-              <w:rPr>
-                <w:sz w:val="16"/>
-                <w:szCs w:val="16"/>
-              </w:rPr>
-              <w:t xml:space="preserve">Samples not handed over with a signed record</w:t>
-            </w:r>
-          </w:p>
-          <w:p>
-            <w:pPr>
-              <w:pStyle w:val="ListParagraph"/>
-              <w:ind w:left="360"/>
-              <w:rPr>
-                <w:sz w:val="16"/>
-                <w:szCs w:val="16"/>
-                <w:lang w:val="en-AU"/>
-              </w:rPr>
-            </w:pPr>
-          </w:p>
-          <w:p>
-            <w:pPr>
-              <w:pStyle w:val="ListParagraph"/>
-              <w:numPr>
-                <w:ilvl w:val="0"/>
-                <w:numId w:val="20"/>
               </w:numPr>
               <w:rPr>
                 <w:sz w:val="16"/>
@@ -8053,334 +6243,6 @@
           </w:p>
         </w:tc>
       </w:tr>
-      <w:tr>
-        <w:trPr>
-          <w:cantSplit/>
-          <w:trHeight w:val="300"/>
-        </w:trPr>
-        <w:tc>
-          <w:tcPr>
-            <w:tcW w:w="4111" w:type="dxa"/>
-            <w:tcBorders>
-              <w:top w:val="single" w:sz="6" w:space="0" w:color="auto"/>
-              <w:left w:val="single" w:sz="6" w:space="0" w:color="auto"/>
-              <w:bottom w:val="single" w:sz="6" w:space="0" w:color="auto"/>
-              <w:right w:val="single" w:sz="6" w:space="0" w:color="auto"/>
-            </w:tcBorders>
-            <w:hideMark/>
-          </w:tcPr>
-          <w:p>
-            <w:pPr>
-              <w:keepNext/>
-              <w:spacing w:after="0" w:line="240" w:lineRule="auto"/>
-              <w:textAlignment w:val="baseline"/>
-              <w:rPr>
-                <w:rFonts w:ascii="Segoe UI" w:eastAsia="Times New Roman" w:hAnsi="Segoe UI" w:cs="Segoe UI"/>
-                <w:kern w:val="0"/>
-                <w:sz w:val="18"/>
-                <w:szCs w:val="18"/>
-                <w:lang w:val="en-AU" w:eastAsia="en-AU"/>
-                <w14:ligatures w14:val="none"/>
-              </w:rPr>
-            </w:pPr>
-            <w:r>
-              <w:rPr>
-                <w:rFonts w:ascii="Aptos" w:eastAsia="Times New Roman" w:hAnsi="Aptos" w:cs="Segoe UI"/>
-                <w:kern w:val="0"/>
-                <w:sz w:val="20"/>
-                <w:szCs w:val="20"/>
-                <w:lang w:eastAsia="en-AU"/>
-                <w14:ligatures w14:val="none"/>
-              </w:rPr>
-              <w:t xml:space="preserve">DOC-3-MET-PRS-WIN-00048-IE v1.0</w:t>
-            </w:r>
-          </w:p>
-        </w:tc>
-        <w:tc>
-          <w:tcPr>
-            <w:tcW w:w="6521" w:type="dxa"/>
-            <w:tcBorders>
-              <w:top w:val="single" w:sz="6" w:space="0" w:color="auto"/>
-              <w:left w:val="single" w:sz="6" w:space="0" w:color="auto"/>
-              <w:bottom w:val="single" w:sz="6" w:space="0" w:color="auto"/>
-              <w:right w:val="single" w:sz="6" w:space="0" w:color="auto"/>
-            </w:tcBorders>
-            <w:hideMark/>
-          </w:tcPr>
-          <w:p>
-            <w:pPr>
-              <w:keepNext/>
-              <w:spacing w:after="0" w:line="240" w:lineRule="auto"/>
-              <w:textAlignment w:val="baseline"/>
-              <w:rPr>
-                <w:rFonts w:ascii="Segoe UI" w:eastAsia="Times New Roman" w:hAnsi="Segoe UI" w:cs="Segoe UI"/>
-                <w:kern w:val="0"/>
-                <w:sz w:val="18"/>
-                <w:szCs w:val="18"/>
-                <w:lang w:val="en-AU" w:eastAsia="en-AU"/>
-                <w14:ligatures w14:val="none"/>
-              </w:rPr>
-            </w:pPr>
-            <w:r>
-              <w:rPr>
-                <w:rFonts w:ascii="Aptos" w:eastAsia="Times New Roman" w:hAnsi="Aptos" w:cs="Segoe UI"/>
-                <w:kern w:val="0"/>
-                <w:sz w:val="20"/>
-                <w:szCs w:val="20"/>
-                <w:lang w:eastAsia="en-AU"/>
-                <w14:ligatures w14:val="none"/>
-              </w:rPr>
-              <w:t xml:space="preserve">Martabe WI Carbon Analyser C2 Check (25/12/2024) - source of Step 4</w:t>
-            </w:r>
-          </w:p>
-        </w:tc>
-      </w:tr>
-      <w:tr>
-        <w:trPr>
-          <w:cantSplit/>
-          <w:trHeight w:val="300"/>
-        </w:trPr>
-        <w:tc>
-          <w:tcPr>
-            <w:tcW w:w="4111" w:type="dxa"/>
-            <w:tcBorders>
-              <w:top w:val="single" w:sz="6" w:space="0" w:color="auto"/>
-              <w:left w:val="single" w:sz="6" w:space="0" w:color="auto"/>
-              <w:bottom w:val="single" w:sz="6" w:space="0" w:color="auto"/>
-              <w:right w:val="single" w:sz="6" w:space="0" w:color="auto"/>
-            </w:tcBorders>
-            <w:hideMark/>
-          </w:tcPr>
-          <w:p>
-            <w:pPr>
-              <w:keepNext/>
-              <w:spacing w:after="0" w:line="240" w:lineRule="auto"/>
-              <w:textAlignment w:val="baseline"/>
-              <w:rPr>
-                <w:rFonts w:ascii="Segoe UI" w:eastAsia="Times New Roman" w:hAnsi="Segoe UI" w:cs="Segoe UI"/>
-                <w:kern w:val="0"/>
-                <w:sz w:val="18"/>
-                <w:szCs w:val="18"/>
-                <w:lang w:val="en-AU" w:eastAsia="en-AU"/>
-                <w14:ligatures w14:val="none"/>
-              </w:rPr>
-            </w:pPr>
-            <w:r>
-              <w:rPr>
-                <w:rFonts w:ascii="Aptos" w:eastAsia="Times New Roman" w:hAnsi="Aptos" w:cs="Segoe UI"/>
-                <w:kern w:val="0"/>
-                <w:sz w:val="20"/>
-                <w:szCs w:val="20"/>
-                <w:lang w:eastAsia="en-AU"/>
-                <w14:ligatures w14:val="none"/>
-              </w:rPr>
-              <w:t xml:space="preserve">DOC-3-MET-PMC-WIN-00111-IE v1.0</w:t>
-            </w:r>
-          </w:p>
-        </w:tc>
-        <w:tc>
-          <w:tcPr>
-            <w:tcW w:w="6521" w:type="dxa"/>
-            <w:tcBorders>
-              <w:top w:val="single" w:sz="6" w:space="0" w:color="auto"/>
-              <w:left w:val="single" w:sz="6" w:space="0" w:color="auto"/>
-              <w:bottom w:val="single" w:sz="6" w:space="0" w:color="auto"/>
-              <w:right w:val="single" w:sz="6" w:space="0" w:color="auto"/>
-            </w:tcBorders>
-            <w:hideMark/>
-          </w:tcPr>
-          <w:p>
-            <w:pPr>
-              <w:keepNext/>
-              <w:spacing w:after="0" w:line="240" w:lineRule="auto"/>
-              <w:textAlignment w:val="baseline"/>
-              <w:rPr>
-                <w:rFonts w:ascii="Segoe UI" w:eastAsia="Times New Roman" w:hAnsi="Segoe UI" w:cs="Segoe UI"/>
-                <w:kern w:val="0"/>
-                <w:sz w:val="18"/>
-                <w:szCs w:val="18"/>
-                <w:lang w:val="en-AU" w:eastAsia="en-AU"/>
-                <w14:ligatures w14:val="none"/>
-              </w:rPr>
-            </w:pPr>
-            <w:r>
-              <w:rPr>
-                <w:rFonts w:ascii="Aptos" w:eastAsia="Times New Roman" w:hAnsi="Aptos" w:cs="Segoe UI"/>
-                <w:kern w:val="0"/>
-                <w:sz w:val="20"/>
-                <w:szCs w:val="20"/>
-                <w:lang w:eastAsia="en-AU"/>
-                <w14:ligatures w14:val="none"/>
-              </w:rPr>
-              <w:t xml:space="preserve">Martabe WI C2 Meter Calibration (25/12/2024) - source of Step 5</w:t>
-            </w:r>
-          </w:p>
-        </w:tc>
-      </w:tr>
-      <w:tr>
-        <w:trPr>
-          <w:cantSplit/>
-          <w:trHeight w:val="300"/>
-        </w:trPr>
-        <w:tc>
-          <w:tcPr>
-            <w:tcW w:w="4111" w:type="dxa"/>
-            <w:tcBorders>
-              <w:top w:val="single" w:sz="6" w:space="0" w:color="auto"/>
-              <w:left w:val="single" w:sz="6" w:space="0" w:color="auto"/>
-              <w:bottom w:val="single" w:sz="6" w:space="0" w:color="auto"/>
-              <w:right w:val="single" w:sz="6" w:space="0" w:color="auto"/>
-            </w:tcBorders>
-            <w:hideMark/>
-          </w:tcPr>
-          <w:p>
-            <w:pPr>
-              <w:keepNext/>
-              <w:spacing w:after="0" w:line="240" w:lineRule="auto"/>
-              <w:textAlignment w:val="baseline"/>
-              <w:rPr>
-                <w:rFonts w:ascii="Segoe UI" w:eastAsia="Times New Roman" w:hAnsi="Segoe UI" w:cs="Segoe UI"/>
-                <w:kern w:val="0"/>
-                <w:sz w:val="18"/>
-                <w:szCs w:val="18"/>
-                <w:lang w:val="en-AU" w:eastAsia="en-AU"/>
-                <w14:ligatures w14:val="none"/>
-              </w:rPr>
-            </w:pPr>
-            <w:r>
-              <w:rPr>
-                <w:rFonts w:ascii="Aptos" w:eastAsia="Times New Roman" w:hAnsi="Aptos" w:cs="Segoe UI"/>
-                <w:kern w:val="0"/>
-                <w:sz w:val="20"/>
-                <w:szCs w:val="20"/>
-                <w:lang w:eastAsia="en-AU"/>
-                <w14:ligatures w14:val="none"/>
-              </w:rPr>
-              <w:t xml:space="preserve">DOC-2-MET-PRM-SOP-00037-IE</w:t>
-            </w:r>
-          </w:p>
-        </w:tc>
-        <w:tc>
-          <w:tcPr>
-            <w:tcW w:w="6521" w:type="dxa"/>
-            <w:tcBorders>
-              <w:top w:val="single" w:sz="6" w:space="0" w:color="auto"/>
-              <w:left w:val="single" w:sz="6" w:space="0" w:color="auto"/>
-              <w:bottom w:val="single" w:sz="6" w:space="0" w:color="auto"/>
-              <w:right w:val="single" w:sz="6" w:space="0" w:color="auto"/>
-            </w:tcBorders>
-            <w:hideMark/>
-          </w:tcPr>
-          <w:p>
-            <w:pPr>
-              <w:keepNext/>
-              <w:spacing w:after="0" w:line="240" w:lineRule="auto"/>
-              <w:textAlignment w:val="baseline"/>
-              <w:rPr>
-                <w:rFonts w:ascii="Segoe UI" w:eastAsia="Times New Roman" w:hAnsi="Segoe UI" w:cs="Segoe UI"/>
-                <w:kern w:val="0"/>
-                <w:sz w:val="18"/>
-                <w:szCs w:val="18"/>
-                <w:lang w:val="en-AU" w:eastAsia="en-AU"/>
-                <w14:ligatures w14:val="none"/>
-              </w:rPr>
-            </w:pPr>
-            <w:r>
-              <w:rPr>
-                <w:rFonts w:ascii="Aptos" w:eastAsia="Times New Roman" w:hAnsi="Aptos" w:cs="Segoe UI"/>
-                <w:kern w:val="0"/>
-                <w:sz w:val="20"/>
-                <w:szCs w:val="20"/>
-                <w:lang w:eastAsia="en-AU"/>
-                <w14:ligatures w14:val="none"/>
-              </w:rPr>
-              <w:t xml:space="preserve">Martabe SOP referenced by the C2 Check WI - not received</w:t>
-            </w:r>
-          </w:p>
-        </w:tc>
-      </w:tr>
-      <w:tr>
-        <w:trPr>
-          <w:cantSplit/>
-          <w:trHeight w:val="300"/>
-        </w:trPr>
-        <w:tc>
-          <w:tcPr>
-            <w:tcW w:w="4111" w:type="dxa"/>
-            <w:tcBorders>
-              <w:top w:val="single" w:sz="6" w:space="0" w:color="auto"/>
-              <w:left w:val="single" w:sz="6" w:space="0" w:color="auto"/>
-              <w:bottom w:val="single" w:sz="6" w:space="0" w:color="auto"/>
-              <w:right w:val="single" w:sz="6" w:space="0" w:color="auto"/>
-            </w:tcBorders>
-            <w:hideMark/>
-          </w:tcPr>
-          <w:p>
-            <w:pPr>
-              <w:keepNext/>
-              <w:spacing w:after="0" w:line="240" w:lineRule="auto"/>
-              <w:textAlignment w:val="baseline"/>
-              <w:rPr>
-                <w:rFonts w:ascii="Segoe UI" w:eastAsia="Times New Roman" w:hAnsi="Segoe UI" w:cs="Segoe UI"/>
-                <w:kern w:val="0"/>
-                <w:sz w:val="18"/>
-                <w:szCs w:val="18"/>
-                <w:lang w:val="en-AU" w:eastAsia="en-AU"/>
-                <w14:ligatures w14:val="none"/>
-              </w:rPr>
-            </w:pPr>
-            <w:r>
-              <w:rPr>
-                <w:rFonts w:ascii="Aptos" w:eastAsia="Times New Roman" w:hAnsi="Aptos" w:cs="Segoe UI"/>
-                <w:kern w:val="0"/>
-                <w:sz w:val="20"/>
-                <w:szCs w:val="20"/>
-                <w:lang w:eastAsia="en-AU"/>
-                <w14:ligatures w14:val="none"/>
-              </w:rPr>
-              <w:t xml:space="preserve">DOC-4-MET-PMC-DFR-00132-EN</w:t>
-            </w:r>
-          </w:p>
-        </w:tc>
-        <w:tc>
-          <w:tcPr>
-            <w:tcW w:w="6521" w:type="dxa"/>
-            <w:tcBorders>
-              <w:top w:val="single" w:sz="6" w:space="0" w:color="auto"/>
-              <w:left w:val="single" w:sz="6" w:space="0" w:color="auto"/>
-              <w:bottom w:val="single" w:sz="6" w:space="0" w:color="auto"/>
-              <w:right w:val="single" w:sz="6" w:space="0" w:color="auto"/>
-            </w:tcBorders>
-            <w:hideMark/>
-          </w:tcPr>
-          <w:p>
-            <w:pPr>
-              <w:keepNext/>
-              <w:spacing w:after="0" w:line="240" w:lineRule="auto"/>
-              <w:textAlignment w:val="baseline"/>
-              <w:rPr>
-                <w:rFonts w:ascii="Segoe UI" w:eastAsia="Times New Roman" w:hAnsi="Segoe UI" w:cs="Segoe UI"/>
-                <w:kern w:val="0"/>
-                <w:sz w:val="18"/>
-                <w:szCs w:val="18"/>
-                <w:lang w:val="en-AU" w:eastAsia="en-AU"/>
-                <w14:ligatures w14:val="none"/>
-              </w:rPr>
-            </w:pPr>
-            <w:r>
-              <w:rPr>
-                <w:rFonts w:ascii="Aptos" w:eastAsia="Times New Roman" w:hAnsi="Aptos" w:cs="Segoe UI"/>
-                <w:kern w:val="0"/>
-                <w:sz w:val="20"/>
-                <w:szCs w:val="20"/>
-                <w:lang w:eastAsia="en-AU"/>
-                <w14:ligatures w14:val="none"/>
-              </w:rPr>
-              <w:t xml:space="preserve">Form C2 Meter Calibration</w:t>
-            </w:r>
-          </w:p>
-        </w:tc>
-      </w:tr>
     </w:tbl>
     <w:p>
       <w:pPr>
@@ -8726,62 +6588,7 @@
                 <w:szCs w:val="20"/>
                 <w:lang w:val="en-ID"/>
               </w:rPr>
-              <w:t xml:space="preserve">5. Person Down at a Tank Top or Launder Opening Do not enter the opening. Call CH19 “EMERGENCY” and call 000. Rescue is by the trained rescue team under the site confined space procedure only.</w:t>
-            </w:r>
-          </w:p>
-          <w:p>
-            <w:pPr>
-              <w:tabs>
-                <w:tab w:val="left" w:pos="3941"/>
-              </w:tabs>
-              <w:autoSpaceDE w:val="0"/>
-              <w:autoSpaceDN w:val="0"/>
-              <w:adjustRightInd w:val="0"/>
-              <w:spacing w:line="276" w:lineRule="auto"/>
-              <w:jc w:val="center"/>
-              <w:rPr>
-                <w:rFonts w:cs="Calibri"/>
-                <w:b/>
-                <w:i/>
-                <w:color w:val="EE0000"/>
-              </w:rPr>
-            </w:pPr>
-          </w:p>
-          <w:p>
-            <w:pPr>
-              <w:tabs>
-                <w:tab w:val="left" w:pos="3941"/>
-              </w:tabs>
-              <w:autoSpaceDE w:val="0"/>
-              <w:autoSpaceDN w:val="0"/>
-              <w:adjustRightInd w:val="0"/>
-              <w:spacing w:line="276" w:lineRule="auto"/>
-              <w:jc w:val="center"/>
-              <w:rPr>
-                <w:rFonts w:asciiTheme="minorHAnsi" w:hAnsiTheme="minorHAnsi" w:cs="Calibri"/>
-                <w:b/>
-                <w:bCs/>
-                <w:i/>
-                <w:iCs/>
-                <w:color w:val="EE0000"/>
-                <w:sz w:val="20"/>
-                <w:szCs w:val="20"/>
-                <w:lang w:val="en-ID"/>
-              </w:rPr>
-            </w:pPr>
-            <w:r>
-              <w:rPr>
-                <w:rFonts w:asciiTheme="minorHAnsi" w:hAnsiTheme="minorHAnsi" w:cs="Calibri"/>
-                <w:b/>
-                <w:bCs/>
-                <w:i/>
-                <w:iCs/>
-                <w:color w:val="EE0000"/>
-                <w:sz w:val="20"/>
-                <w:szCs w:val="20"/>
-                <w:lang w:val="en-ID"/>
-              </w:rPr>
-              <w:t xml:space="preserve">6. Fall from Height Do not move the injured person unless they are in danger. Call CH19 “EMERGENCY”, call 000, and notify the Shift Supervisor.</w:t>
+              <w:t xml:space="preserve">5. Fall from Height Do not move the injured person unless they are in danger. Call CH19 “EMERGENCY”, call 000, and notify the Shift Supervisor.</w:t>
             </w:r>
           </w:p>
           <w:p>
@@ -11345,12 +9152,6 @@
     </w:lvlOverride>
   </w:num>
   <w:num w:numId="19">
-    <w:abstractNumId w:val="9"/>
-    <w:lvlOverride w:ilvl="0">
-      <w:startOverride w:val="1"/>
-    </w:lvlOverride>
-  </w:num>
-  <w:num w:numId="20">
     <w:abstractNumId w:val="9"/>
     <w:lvlOverride w:ilvl="0">
       <w:startOverride w:val="1"/>

</xml_diff>

<commit_message>
Audit Heritage SWIs (201, 203) against pre-conversion SWIs; restore induction and records lines; split register per series
Co-Authored-By: Claude Opus 5.5 <noreply@anthropic.com>
Claude-Session: https://claude.ai/code/session_01UHnSDEBA56GANs2gfXuK2P
</commit_message>
<xml_diff>
--- a/SWI/201-Plant-Sampling/MM-4034-033-OR-03-SWI-PRO-MET-201-005-Carbon-Concentration-Measurement-in-CIL-Tanks-RevA.docx
+++ b/SWI/201-Plant-Sampling/MM-4034-033-OR-03-SWI-PRO-MET-201-005-Carbon-Concentration-Measurement-in-CIL-Tanks-RevA.docx
@@ -1001,25 +1001,6 @@
           <w:lang w:eastAsia="en-AU"/>
         </w:rPr>
       </w:pPr>
-    </w:p>
-    <w:p>
-      <w:pPr>
-        <w:pStyle w:val="Heading1"/>
-        <w:tabs>
-          <w:tab w:val="num" w:pos="851"/>
-          <w:tab w:val="right" w:leader="dot" w:pos="9639"/>
-        </w:tabs>
-        <w:spacing w:before="0" w:after="0"/>
-        <w:ind w:left="851" w:hanging="851"/>
-        <w:rPr>
-          <w:rFonts w:cstheme="minorHAnsi"/>
-          <w:b/>
-          <w:color w:val="996633"/>
-          <w:sz w:val="24"/>
-          <w:szCs w:val="24"/>
-          <w:lang w:eastAsia="en-AU"/>
-        </w:rPr>
-      </w:pPr>
       <w:r>
         <w:rPr>
           <w:rFonts w:cstheme="minorHAnsi"/>
@@ -3665,7 +3646,7 @@
                 <w:lang w:val="en-AU" w:eastAsia="en-AU"/>
                 <w14:ligatures w14:val="none"/>
               </w:rPr>
-              <w:t xml:space="preserve">Confirm you are trained and signed off against this SWI, signed on to JSEA-PRO-MET-201-005 at a communication session, and authorised by the Shift Supervisor.</w:t>
+              <w:t xml:space="preserve">Confirm you are trained and signed off against this SWI, signed on to JSEA-PRO-MET-201-005 at a communication session, site inducted with current cyanide awareness and gas detection competency where the area requires it, and authorised by the Shift Supervisor.</w:t>
             </w:r>
           </w:p>
           <w:p>

</xml_diff>